<commit_message>
Add independent Desktop, shared climate sources and bilingual equation help
</commit_message>
<xml_diff>
--- a/Documents/05_Climate_Data_Sources_Directory/Climate_Data_Sources_Comparison_Guide.docx
+++ b/Documents/05_Climate_Data_Sources_Directory/Climate_Data_Sources_Comparison_Guide.docx
@@ -4,3825 +4,746 @@
   <w:body>
     <w:p>
       <w:pPr>
-        <w:spacing w:after="80"/>
-        <w:jc w:val="center"/>
+        <w:pStyle w:val="Title"/>
       </w:pPr>
       <w:r>
-        <w:rPr>
-          <w:rFonts w:ascii="Arial" w:hAnsi="Arial"/>
-          <w:b/>
-          <w:color w:val="0F172A"/>
-          <w:sz w:val="40"/>
-        </w:rPr>
-        <w:t>دليل ومقارنة مصادر ونماذج البيانات المناخية</w:t>
-        <w:br/>
-        <w:t>Climate Data Sources &amp; Models Comparison Guide</w:t>
+        <w:t>MIRSAD climate data sources comparison</w:t>
       </w:r>
     </w:p>
     <w:p>
       <w:pPr>
-        <w:spacing w:after="280"/>
-        <w:jc w:val="center"/>
+        <w:pStyle w:val="Heading1"/>
+        <w:jc w:val="start"/>
+        <w:bidi/>
       </w:pPr>
       <w:r>
         <w:rPr>
-          <w:rFonts w:ascii="Calibri" w:hAnsi="Calibri"/>
-          <w:color w:val="0284C7"/>
-          <w:sz w:val="22"/>
+          <w:rtl/>
         </w:rPr>
-        <w:t>NASA POWER &amp; NOAA/WMO Ground Weather Stations Climate Atlas Generator</w:t>
-        <w:br/>
-        <w:t>Author: Ahmad Ibrahim (أحمد إبراهيم) | Version 2.0 (October 2026)</w:t>
+        <w:t>مقارنة مصادر البيانات المناخية في مرصاد</w:t>
+      </w:r>
+    </w:p>
+    <w:p>
+      <w:r>
+        <w:t>Ahmad Ibrahim  |  18 October 2026  |  Development 0.4.0.dev7</w:t>
+      </w:r>
+    </w:p>
+    <w:p>
+      <w:r>
+        <w:t>This guide describes the implemented source adapters, native spatial and temporal resolution, archive coverage and account requirements shared by the ArcGIS toolboxes and MIRSAD Desktop. It replaces the previous five-source comparison, whose completeness and no-login CDS claims were inaccurate. Available variables and actual per-run provenance determine which indicators can be calculated.</w:t>
       </w:r>
     </w:p>
     <w:p>
       <w:pPr>
-        <w:spacing w:after="240"/>
+        <w:jc w:val="start"/>
+        <w:bidi/>
       </w:pPr>
       <w:r>
         <w:rPr>
-          <w:rFonts w:ascii="Calibri" w:hAnsi="Calibri"/>
-          <w:color w:val="1E293B"/>
-          <w:sz w:val="21"/>
+          <w:rtl/>
         </w:rPr>
-        <w:t>يقدم هذا المستند دليلاً علمياً وتطبيقياً مقارناً لمصادر ونماذج البيانات المناخية الخمسة المعتمدة في أداة توليد الأطلس المناخي (MIRSAD). يوضح الجدول الفترات الزمنية الفعلية (بداية التغطية ونهايتها)، والدقة المكانية، وطبيعة البيانات، والعناصر المقاسة والمنمذجة، ليتمكن الباحث من اتخاذ القرار السليم في اختيار المصدر الأنسب لمنطقة دراسته وهدفه العلمي.</w:t>
+        <w:t>يوضح هذا الدليل المصادر المنفذة والدقة الأصلية والفترات الزمنية ومتطلبات الحساب المشتركة بين التول بوكس ومرصاد ديسكتوب. يستبدل المقارنة القديمة وادعاءات اكتمال البيانات والتنزيل من CDS دون دخول. المتغيرات المتاحة وبيانات التشغيل الفعلية تحدد المؤشرات الممكن حسابها.</w:t>
       </w:r>
     </w:p>
     <w:p>
       <w:pPr>
-        <w:spacing w:before="240" w:after="120"/>
+        <w:pStyle w:val="Heading2"/>
       </w:pPr>
       <w:r>
-        <w:rPr>
-          <w:rFonts w:ascii="Arial" w:hAnsi="Arial"/>
-          <w:b/>
-          <w:color w:val="0284C7"/>
-          <w:sz w:val="26"/>
-        </w:rPr>
-        <w:t>1. جدول المقارنة السريع والشامل / Master Summary Matrix</w:t>
+        <w:t>Automatic product selection</w:t>
       </w:r>
     </w:p>
-    <w:tbl>
-      <w:tblPr>
-        <w:tblW w:type="auto" w:w="0"/>
-        <w:jc w:val="center"/>
-        <w:tblLayout w:type="fixed"/>
-        <w:tblLook w:firstColumn="1" w:firstRow="1" w:lastColumn="0" w:lastRow="0" w:noHBand="0" w:noVBand="1" w:val="04A0"/>
-      </w:tblPr>
-      <w:tblGrid>
-        <w:gridCol w:w="1680"/>
-        <w:gridCol w:w="1680"/>
-        <w:gridCol w:w="1680"/>
-        <w:gridCol w:w="1680"/>
-        <w:gridCol w:w="1680"/>
-        <w:gridCol w:w="1680"/>
-      </w:tblGrid>
-      <w:tr>
-        <w:tc>
-          <w:tcPr>
-            <w:tcW w:type="dxa" w:w="3168"/>
-            <w:shd w:fill="0F172A"/>
-            <w:tcMar>
-              <w:top w:w="120" w:type="dxa"/>
-              <w:bottom w:w="120" w:type="dxa"/>
-              <w:left w:w="100" w:type="dxa"/>
-              <w:right w:w="100" w:type="dxa"/>
-            </w:tcMar>
-          </w:tcPr>
-          <w:p>
-            <w:pPr>
-              <w:jc w:val="center"/>
-            </w:pPr>
-            <w:r>
-              <w:rPr>
-                <w:rFonts w:ascii="Arial" w:hAnsi="Arial"/>
-                <w:b/>
-                <w:color w:val="FFFFFF"/>
-                <w:sz w:val="17"/>
-              </w:rPr>
-              <w:t>مصدر البيانات المناخية</w:t>
-              <w:br/>
-              <w:t>Data Source</w:t>
-            </w:r>
-          </w:p>
-        </w:tc>
-        <w:tc>
-          <w:tcPr>
-            <w:tcW w:type="dxa" w:w="1296"/>
-            <w:shd w:fill="0F172A"/>
-            <w:tcMar>
-              <w:top w:w="120" w:type="dxa"/>
-              <w:bottom w:w="120" w:type="dxa"/>
-              <w:left w:w="100" w:type="dxa"/>
-              <w:right w:w="100" w:type="dxa"/>
-            </w:tcMar>
-          </w:tcPr>
-          <w:p>
-            <w:pPr>
-              <w:jc w:val="center"/>
-            </w:pPr>
-            <w:r>
-              <w:rPr>
-                <w:rFonts w:ascii="Arial" w:hAnsi="Arial"/>
-                <w:b/>
-                <w:color w:val="FFFFFF"/>
-                <w:sz w:val="17"/>
-              </w:rPr>
-              <w:t>سنة البداية</w:t>
-              <w:br/>
-              <w:t>Start Year</w:t>
-            </w:r>
-          </w:p>
-        </w:tc>
-        <w:tc>
-          <w:tcPr>
-            <w:tcW w:type="dxa" w:w="1296"/>
-            <w:shd w:fill="0F172A"/>
-            <w:tcMar>
-              <w:top w:w="120" w:type="dxa"/>
-              <w:bottom w:w="120" w:type="dxa"/>
-              <w:left w:w="100" w:type="dxa"/>
-              <w:right w:w="100" w:type="dxa"/>
-            </w:tcMar>
-          </w:tcPr>
-          <w:p>
-            <w:pPr>
-              <w:jc w:val="center"/>
-            </w:pPr>
-            <w:r>
-              <w:rPr>
-                <w:rFonts w:ascii="Arial" w:hAnsi="Arial"/>
-                <w:b/>
-                <w:color w:val="FFFFFF"/>
-                <w:sz w:val="17"/>
-              </w:rPr>
-              <w:t>سنة النهاية</w:t>
-              <w:br/>
-              <w:t>End Year</w:t>
-            </w:r>
-          </w:p>
-        </w:tc>
-        <w:tc>
-          <w:tcPr>
-            <w:tcW w:type="dxa" w:w="1584"/>
-            <w:shd w:fill="0F172A"/>
-            <w:tcMar>
-              <w:top w:w="120" w:type="dxa"/>
-              <w:bottom w:w="120" w:type="dxa"/>
-              <w:left w:w="100" w:type="dxa"/>
-              <w:right w:w="100" w:type="dxa"/>
-            </w:tcMar>
-          </w:tcPr>
-          <w:p>
-            <w:pPr>
-              <w:jc w:val="center"/>
-            </w:pPr>
-            <w:r>
-              <w:rPr>
-                <w:rFonts w:ascii="Arial" w:hAnsi="Arial"/>
-                <w:b/>
-                <w:color w:val="FFFFFF"/>
-                <w:sz w:val="17"/>
-              </w:rPr>
-              <w:t>الدقة المكانية</w:t>
-              <w:br/>
-              <w:t>Spatial Res.</w:t>
-            </w:r>
-          </w:p>
-        </w:tc>
-        <w:tc>
-          <w:tcPr>
-            <w:tcW w:type="dxa" w:w="2016"/>
-            <w:shd w:fill="0F172A"/>
-            <w:tcMar>
-              <w:top w:w="120" w:type="dxa"/>
-              <w:bottom w:w="120" w:type="dxa"/>
-              <w:left w:w="100" w:type="dxa"/>
-              <w:right w:w="100" w:type="dxa"/>
-            </w:tcMar>
-          </w:tcPr>
-          <w:p>
-            <w:pPr>
-              <w:jc w:val="center"/>
-            </w:pPr>
-            <w:r>
-              <w:rPr>
-                <w:rFonts w:ascii="Arial" w:hAnsi="Arial"/>
-                <w:b/>
-                <w:color w:val="FFFFFF"/>
-                <w:sz w:val="17"/>
-              </w:rPr>
-              <w:t>طبيعة البيانات</w:t>
-              <w:br/>
-              <w:t>Data Nature</w:t>
-            </w:r>
-          </w:p>
-        </w:tc>
-        <w:tc>
-          <w:tcPr>
-            <w:tcW w:type="dxa" w:w="1440"/>
-            <w:shd w:fill="0F172A"/>
-            <w:tcMar>
-              <w:top w:w="120" w:type="dxa"/>
-              <w:bottom w:w="120" w:type="dxa"/>
-              <w:left w:w="100" w:type="dxa"/>
-              <w:right w:w="100" w:type="dxa"/>
-            </w:tcMar>
-          </w:tcPr>
-          <w:p>
-            <w:pPr>
-              <w:jc w:val="center"/>
-            </w:pPr>
-            <w:r>
-              <w:rPr>
-                <w:rFonts w:ascii="Arial" w:hAnsi="Arial"/>
-                <w:b/>
-                <w:color w:val="FFFFFF"/>
-                <w:sz w:val="17"/>
-              </w:rPr>
-              <w:t>اكتمال البيانات</w:t>
-              <w:br/>
-              <w:t>Zero-Gap</w:t>
-            </w:r>
-          </w:p>
-        </w:tc>
-      </w:tr>
-      <w:tr>
-        <w:tc>
-          <w:tcPr>
-            <w:tcW w:type="dxa" w:w="3168"/>
-            <w:shd w:fill="FFFFFF"/>
-            <w:tcMar>
-              <w:top w:w="90" w:type="dxa"/>
-              <w:bottom w:w="90" w:type="dxa"/>
-              <w:left w:w="100" w:type="dxa"/>
-              <w:right w:w="100" w:type="dxa"/>
-            </w:tcMar>
-          </w:tcPr>
-          <w:p>
-            <w:pPr>
-              <w:jc w:val="left"/>
-            </w:pPr>
-            <w:r>
-              <w:rPr>
-                <w:rFonts w:ascii="Calibri" w:hAnsi="Calibri"/>
-                <w:b/>
-                <w:color w:val="0284C7"/>
-                <w:sz w:val="17"/>
-              </w:rPr>
-              <w:t>Hybrid Climate Engine (Default)</w:t>
-              <w:br/>
-              <w:t>النموذج الهجين (الافتراضي للأداة)</w:t>
-            </w:r>
-          </w:p>
-        </w:tc>
-        <w:tc>
-          <w:tcPr>
-            <w:tcW w:type="dxa" w:w="1296"/>
-            <w:shd w:fill="FFFFFF"/>
-            <w:tcMar>
-              <w:top w:w="90" w:type="dxa"/>
-              <w:bottom w:w="90" w:type="dxa"/>
-              <w:left w:w="100" w:type="dxa"/>
-              <w:right w:w="100" w:type="dxa"/>
-            </w:tcMar>
-          </w:tcPr>
-          <w:p>
-            <w:pPr>
-              <w:jc w:val="center"/>
-            </w:pPr>
-            <w:r>
-              <w:rPr>
-                <w:rFonts w:ascii="Calibri" w:hAnsi="Calibri"/>
-                <w:color w:val="1E293B"/>
-                <w:sz w:val="17"/>
-              </w:rPr>
-              <w:t>1901</w:t>
-              <w:br/>
-              <w:t>(تاريخ المحطة)</w:t>
-            </w:r>
-          </w:p>
-        </w:tc>
-        <w:tc>
-          <w:tcPr>
-            <w:tcW w:type="dxa" w:w="1296"/>
-            <w:shd w:fill="FFFFFF"/>
-            <w:tcMar>
-              <w:top w:w="90" w:type="dxa"/>
-              <w:bottom w:w="90" w:type="dxa"/>
-              <w:left w:w="100" w:type="dxa"/>
-              <w:right w:w="100" w:type="dxa"/>
-            </w:tcMar>
-          </w:tcPr>
-          <w:p>
-            <w:pPr>
-              <w:jc w:val="center"/>
-            </w:pPr>
-            <w:r>
-              <w:rPr>
-                <w:rFonts w:ascii="Calibri" w:hAnsi="Calibri"/>
-                <w:color w:val="1E293B"/>
-                <w:sz w:val="17"/>
-              </w:rPr>
-              <w:t>Present</w:t>
-              <w:br/>
-              <w:t>الوقت الحاضر</w:t>
-            </w:r>
-          </w:p>
-        </w:tc>
-        <w:tc>
-          <w:tcPr>
-            <w:tcW w:type="dxa" w:w="1584"/>
-            <w:shd w:fill="FFFFFF"/>
-            <w:tcMar>
-              <w:top w:w="90" w:type="dxa"/>
-              <w:bottom w:w="90" w:type="dxa"/>
-              <w:left w:w="100" w:type="dxa"/>
-              <w:right w:w="100" w:type="dxa"/>
-            </w:tcMar>
-          </w:tcPr>
-          <w:p>
-            <w:pPr>
-              <w:jc w:val="center"/>
-            </w:pPr>
-            <w:r>
-              <w:rPr>
-                <w:rFonts w:ascii="Calibri" w:hAnsi="Calibri"/>
-                <w:color w:val="1E293B"/>
-                <w:sz w:val="17"/>
-              </w:rPr>
-              <w:t>Point Station</w:t>
-              <w:br/>
-              <w:t>إحداثيات المحطة</w:t>
-            </w:r>
-          </w:p>
-        </w:tc>
-        <w:tc>
-          <w:tcPr>
-            <w:tcW w:type="dxa" w:w="2016"/>
-            <w:shd w:fill="FFFFFF"/>
-            <w:tcMar>
-              <w:top w:w="90" w:type="dxa"/>
-              <w:bottom w:w="90" w:type="dxa"/>
-              <w:left w:w="100" w:type="dxa"/>
-              <w:right w:w="100" w:type="dxa"/>
-            </w:tcMar>
-          </w:tcPr>
-          <w:p>
-            <w:pPr>
-              <w:jc w:val="center"/>
-            </w:pPr>
-            <w:r>
-              <w:rPr>
-                <w:rFonts w:ascii="Calibri" w:hAnsi="Calibri"/>
-                <w:color w:val="1E293B"/>
-                <w:sz w:val="17"/>
-              </w:rPr>
-              <w:t>Fused Multi-Source</w:t>
-              <w:br/>
-              <w:t>رصد حقيقي + إكمال آلي + أقمار</w:t>
-            </w:r>
-          </w:p>
-        </w:tc>
-        <w:tc>
-          <w:tcPr>
-            <w:tcW w:type="dxa" w:w="1440"/>
-            <w:shd w:fill="FFFFFF"/>
-            <w:tcMar>
-              <w:top w:w="90" w:type="dxa"/>
-              <w:bottom w:w="90" w:type="dxa"/>
-              <w:left w:w="100" w:type="dxa"/>
-              <w:right w:w="100" w:type="dxa"/>
-            </w:tcMar>
-          </w:tcPr>
-          <w:p>
-            <w:pPr>
-              <w:jc w:val="center"/>
-            </w:pPr>
-            <w:r>
-              <w:rPr>
-                <w:rFonts w:ascii="Calibri" w:hAnsi="Calibri"/>
-                <w:b/>
-                <w:color w:val="0284C7"/>
-                <w:sz w:val="17"/>
-              </w:rPr>
-              <w:t>100% Guaranteed</w:t>
-              <w:br/>
-              <w:t>مضمون بالكامل</w:t>
-            </w:r>
-          </w:p>
-        </w:tc>
-      </w:tr>
-      <w:tr>
-        <w:tc>
-          <w:tcPr>
-            <w:tcW w:type="dxa" w:w="3168"/>
-            <w:shd w:fill="F8FAFC"/>
-            <w:tcMar>
-              <w:top w:w="90" w:type="dxa"/>
-              <w:bottom w:w="90" w:type="dxa"/>
-              <w:left w:w="100" w:type="dxa"/>
-              <w:right w:w="100" w:type="dxa"/>
-            </w:tcMar>
-          </w:tcPr>
-          <w:p>
-            <w:pPr>
-              <w:jc w:val="left"/>
-            </w:pPr>
-            <w:r>
-              <w:rPr>
-                <w:rFonts w:ascii="Calibri" w:hAnsi="Calibri"/>
-                <w:color w:val="1E293B"/>
-                <w:sz w:val="17"/>
-              </w:rPr>
-              <w:t>NOAA ISD / GHCN Ground Archive</w:t>
-              <w:br/>
-              <w:t>أرشيف الرصد الأرضي المباشر</w:t>
-            </w:r>
-          </w:p>
-        </w:tc>
-        <w:tc>
-          <w:tcPr>
-            <w:tcW w:type="dxa" w:w="1296"/>
-            <w:shd w:fill="F8FAFC"/>
-            <w:tcMar>
-              <w:top w:w="90" w:type="dxa"/>
-              <w:bottom w:w="90" w:type="dxa"/>
-              <w:left w:w="100" w:type="dxa"/>
-              <w:right w:w="100" w:type="dxa"/>
-            </w:tcMar>
-          </w:tcPr>
-          <w:p>
-            <w:pPr>
-              <w:jc w:val="center"/>
-            </w:pPr>
-            <w:r>
-              <w:rPr>
-                <w:rFonts w:ascii="Calibri" w:hAnsi="Calibri"/>
-                <w:color w:val="1E293B"/>
-                <w:sz w:val="17"/>
-              </w:rPr>
-              <w:t>1901</w:t>
-              <w:br/>
-              <w:t>(1850s)</w:t>
-            </w:r>
-          </w:p>
-        </w:tc>
-        <w:tc>
-          <w:tcPr>
-            <w:tcW w:type="dxa" w:w="1296"/>
-            <w:shd w:fill="F8FAFC"/>
-            <w:tcMar>
-              <w:top w:w="90" w:type="dxa"/>
-              <w:bottom w:w="90" w:type="dxa"/>
-              <w:left w:w="100" w:type="dxa"/>
-              <w:right w:w="100" w:type="dxa"/>
-            </w:tcMar>
-          </w:tcPr>
-          <w:p>
-            <w:pPr>
-              <w:jc w:val="center"/>
-            </w:pPr>
-            <w:r>
-              <w:rPr>
-                <w:rFonts w:ascii="Calibri" w:hAnsi="Calibri"/>
-                <w:color w:val="1E293B"/>
-                <w:sz w:val="17"/>
-              </w:rPr>
-              <w:t>Present</w:t>
-              <w:br/>
-              <w:t>(Real-Time)</w:t>
-            </w:r>
-          </w:p>
-        </w:tc>
-        <w:tc>
-          <w:tcPr>
-            <w:tcW w:type="dxa" w:w="1584"/>
-            <w:shd w:fill="F8FAFC"/>
-            <w:tcMar>
-              <w:top w:w="90" w:type="dxa"/>
-              <w:bottom w:w="90" w:type="dxa"/>
-              <w:left w:w="100" w:type="dxa"/>
-              <w:right w:w="100" w:type="dxa"/>
-            </w:tcMar>
-          </w:tcPr>
-          <w:p>
-            <w:pPr>
-              <w:jc w:val="center"/>
-            </w:pPr>
-            <w:r>
-              <w:rPr>
-                <w:rFonts w:ascii="Calibri" w:hAnsi="Calibri"/>
-                <w:color w:val="1E293B"/>
-                <w:sz w:val="17"/>
-              </w:rPr>
-              <w:t>Point Station</w:t>
-              <w:br/>
-              <w:t>أجهزة المحطة</w:t>
-            </w:r>
-          </w:p>
-        </w:tc>
-        <w:tc>
-          <w:tcPr>
-            <w:tcW w:type="dxa" w:w="2016"/>
-            <w:shd w:fill="F8FAFC"/>
-            <w:tcMar>
-              <w:top w:w="90" w:type="dxa"/>
-              <w:bottom w:w="90" w:type="dxa"/>
-              <w:left w:w="100" w:type="dxa"/>
-              <w:right w:w="100" w:type="dxa"/>
-            </w:tcMar>
-          </w:tcPr>
-          <w:p>
-            <w:pPr>
-              <w:jc w:val="center"/>
-            </w:pPr>
-            <w:r>
-              <w:rPr>
-                <w:rFonts w:ascii="Calibri" w:hAnsi="Calibri"/>
-                <w:color w:val="1E293B"/>
-                <w:sz w:val="17"/>
-              </w:rPr>
-              <w:t>Physical Instruments</w:t>
-              <w:br/>
-              <w:t>رصد ميداني بحت من المستشعرات</w:t>
-            </w:r>
-          </w:p>
-        </w:tc>
-        <w:tc>
-          <w:tcPr>
-            <w:tcW w:type="dxa" w:w="1440"/>
-            <w:shd w:fill="F8FAFC"/>
-            <w:tcMar>
-              <w:top w:w="90" w:type="dxa"/>
-              <w:bottom w:w="90" w:type="dxa"/>
-              <w:left w:w="100" w:type="dxa"/>
-              <w:right w:w="100" w:type="dxa"/>
-            </w:tcMar>
-          </w:tcPr>
-          <w:p>
-            <w:pPr>
-              <w:jc w:val="center"/>
-            </w:pPr>
-            <w:r>
-              <w:rPr>
-                <w:rFonts w:ascii="Calibri" w:hAnsi="Calibri"/>
-                <w:color w:val="1E293B"/>
-                <w:sz w:val="17"/>
-              </w:rPr>
-              <w:t>Subject to Gaps</w:t>
-              <w:br/>
-              <w:t>معرض لفجوات الصيانة</w:t>
-            </w:r>
-          </w:p>
-        </w:tc>
-      </w:tr>
-      <w:tr>
-        <w:tc>
-          <w:tcPr>
-            <w:tcW w:type="dxa" w:w="3168"/>
-            <w:shd w:fill="FFFFFF"/>
-            <w:tcMar>
-              <w:top w:w="90" w:type="dxa"/>
-              <w:bottom w:w="90" w:type="dxa"/>
-              <w:left w:w="100" w:type="dxa"/>
-              <w:right w:w="100" w:type="dxa"/>
-            </w:tcMar>
-          </w:tcPr>
-          <w:p>
-            <w:pPr>
-              <w:jc w:val="left"/>
-            </w:pPr>
-            <w:r>
-              <w:rPr>
-                <w:rFonts w:ascii="Calibri" w:hAnsi="Calibri"/>
-                <w:color w:val="1E293B"/>
-                <w:sz w:val="17"/>
-              </w:rPr>
-              <w:t>NASA POWER Agroclimatology</w:t>
-              <w:br/>
-              <w:t>نموذج ناسا للمناخ الزراعي</w:t>
-            </w:r>
-          </w:p>
-        </w:tc>
-        <w:tc>
-          <w:tcPr>
-            <w:tcW w:type="dxa" w:w="1296"/>
-            <w:shd w:fill="FFFFFF"/>
-            <w:tcMar>
-              <w:top w:w="90" w:type="dxa"/>
-              <w:bottom w:w="90" w:type="dxa"/>
-              <w:left w:w="100" w:type="dxa"/>
-              <w:right w:w="100" w:type="dxa"/>
-            </w:tcMar>
-          </w:tcPr>
-          <w:p>
-            <w:pPr>
-              <w:jc w:val="center"/>
-            </w:pPr>
-            <w:r>
-              <w:rPr>
-                <w:rFonts w:ascii="Calibri" w:hAnsi="Calibri"/>
-                <w:color w:val="1E293B"/>
-                <w:sz w:val="17"/>
-              </w:rPr>
-              <w:t>1981</w:t>
-              <w:br/>
-              <w:t>(1984 Solar)</w:t>
-            </w:r>
-          </w:p>
-        </w:tc>
-        <w:tc>
-          <w:tcPr>
-            <w:tcW w:type="dxa" w:w="1296"/>
-            <w:shd w:fill="FFFFFF"/>
-            <w:tcMar>
-              <w:top w:w="90" w:type="dxa"/>
-              <w:bottom w:w="90" w:type="dxa"/>
-              <w:left w:w="100" w:type="dxa"/>
-              <w:right w:w="100" w:type="dxa"/>
-            </w:tcMar>
-          </w:tcPr>
-          <w:p>
-            <w:pPr>
-              <w:jc w:val="center"/>
-            </w:pPr>
-            <w:r>
-              <w:rPr>
-                <w:rFonts w:ascii="Calibri" w:hAnsi="Calibri"/>
-                <w:color w:val="1E293B"/>
-                <w:sz w:val="17"/>
-              </w:rPr>
-              <w:t>Present</w:t>
-              <w:br/>
-              <w:t>(2-4 days)</w:t>
-            </w:r>
-          </w:p>
-        </w:tc>
-        <w:tc>
-          <w:tcPr>
-            <w:tcW w:type="dxa" w:w="1584"/>
-            <w:shd w:fill="FFFFFF"/>
-            <w:tcMar>
-              <w:top w:w="90" w:type="dxa"/>
-              <w:bottom w:w="90" w:type="dxa"/>
-              <w:left w:w="100" w:type="dxa"/>
-              <w:right w:w="100" w:type="dxa"/>
-            </w:tcMar>
-          </w:tcPr>
-          <w:p>
-            <w:pPr>
-              <w:jc w:val="center"/>
-            </w:pPr>
-            <w:r>
-              <w:rPr>
-                <w:rFonts w:ascii="Calibri" w:hAnsi="Calibri"/>
-                <w:color w:val="1E293B"/>
-                <w:sz w:val="17"/>
-              </w:rPr>
-              <w:t>0.5° × 0.625°</w:t>
-              <w:br/>
-              <w:t>(~50 × 60 km)</w:t>
-            </w:r>
-          </w:p>
-        </w:tc>
-        <w:tc>
-          <w:tcPr>
-            <w:tcW w:type="dxa" w:w="2016"/>
-            <w:shd w:fill="FFFFFF"/>
-            <w:tcMar>
-              <w:top w:w="90" w:type="dxa"/>
-              <w:bottom w:w="90" w:type="dxa"/>
-              <w:left w:w="100" w:type="dxa"/>
-              <w:right w:w="100" w:type="dxa"/>
-            </w:tcMar>
-          </w:tcPr>
-          <w:p>
-            <w:pPr>
-              <w:jc w:val="center"/>
-            </w:pPr>
-            <w:r>
-              <w:rPr>
-                <w:rFonts w:ascii="Calibri" w:hAnsi="Calibri"/>
-                <w:color w:val="1E293B"/>
-                <w:sz w:val="17"/>
-              </w:rPr>
-              <w:t>Gridded Reanalysis</w:t>
-              <w:br/>
-              <w:t>إعادة تحليل شبكية MERRA-2</w:t>
-            </w:r>
-          </w:p>
-        </w:tc>
-        <w:tc>
-          <w:tcPr>
-            <w:tcW w:type="dxa" w:w="1440"/>
-            <w:shd w:fill="FFFFFF"/>
-            <w:tcMar>
-              <w:top w:w="90" w:type="dxa"/>
-              <w:bottom w:w="90" w:type="dxa"/>
-              <w:left w:w="100" w:type="dxa"/>
-              <w:right w:w="100" w:type="dxa"/>
-            </w:tcMar>
-          </w:tcPr>
-          <w:p>
-            <w:pPr>
-              <w:jc w:val="center"/>
-            </w:pPr>
-            <w:r>
-              <w:rPr>
-                <w:rFonts w:ascii="Calibri" w:hAnsi="Calibri"/>
-                <w:color w:val="1E293B"/>
-                <w:sz w:val="17"/>
-              </w:rPr>
-              <w:t>100% Gridded</w:t>
-              <w:br/>
-              <w:t>شبكي مكتمل عالمياً</w:t>
-            </w:r>
-          </w:p>
-        </w:tc>
-      </w:tr>
-      <w:tr>
-        <w:tc>
-          <w:tcPr>
-            <w:tcW w:type="dxa" w:w="3168"/>
-            <w:shd w:fill="F8FAFC"/>
-            <w:tcMar>
-              <w:top w:w="90" w:type="dxa"/>
-              <w:bottom w:w="90" w:type="dxa"/>
-              <w:left w:w="100" w:type="dxa"/>
-              <w:right w:w="100" w:type="dxa"/>
-            </w:tcMar>
-          </w:tcPr>
-          <w:p>
-            <w:pPr>
-              <w:jc w:val="left"/>
-            </w:pPr>
-            <w:r>
-              <w:rPr>
-                <w:rFonts w:ascii="Calibri" w:hAnsi="Calibri"/>
-                <w:color w:val="1E293B"/>
-                <w:sz w:val="17"/>
-              </w:rPr>
-              <w:t>Open-Meteo ERA5 / ERA5-Land</w:t>
-              <w:br/>
-              <w:t>النموذج الأوروبي عالي الدقة</w:t>
-            </w:r>
-          </w:p>
-        </w:tc>
-        <w:tc>
-          <w:tcPr>
-            <w:tcW w:type="dxa" w:w="1296"/>
-            <w:shd w:fill="F8FAFC"/>
-            <w:tcMar>
-              <w:top w:w="90" w:type="dxa"/>
-              <w:bottom w:w="90" w:type="dxa"/>
-              <w:left w:w="100" w:type="dxa"/>
-              <w:right w:w="100" w:type="dxa"/>
-            </w:tcMar>
-          </w:tcPr>
-          <w:p>
-            <w:pPr>
-              <w:jc w:val="center"/>
-            </w:pPr>
-            <w:r>
-              <w:rPr>
-                <w:rFonts w:ascii="Calibri" w:hAnsi="Calibri"/>
-                <w:color w:val="1E293B"/>
-                <w:sz w:val="17"/>
-              </w:rPr>
-              <w:t>1940</w:t>
-              <w:br/>
-              <w:t>(1950 ERA5-L)</w:t>
-            </w:r>
-          </w:p>
-        </w:tc>
-        <w:tc>
-          <w:tcPr>
-            <w:tcW w:type="dxa" w:w="1296"/>
-            <w:shd w:fill="F8FAFC"/>
-            <w:tcMar>
-              <w:top w:w="90" w:type="dxa"/>
-              <w:bottom w:w="90" w:type="dxa"/>
-              <w:left w:w="100" w:type="dxa"/>
-              <w:right w:w="100" w:type="dxa"/>
-            </w:tcMar>
-          </w:tcPr>
-          <w:p>
-            <w:pPr>
-              <w:jc w:val="center"/>
-            </w:pPr>
-            <w:r>
-              <w:rPr>
-                <w:rFonts w:ascii="Calibri" w:hAnsi="Calibri"/>
-                <w:color w:val="1E293B"/>
-                <w:sz w:val="17"/>
-              </w:rPr>
-              <w:t>Present</w:t>
-              <w:br/>
-              <w:t>(2-5 days)</w:t>
-            </w:r>
-          </w:p>
-        </w:tc>
-        <w:tc>
-          <w:tcPr>
-            <w:tcW w:type="dxa" w:w="1584"/>
-            <w:shd w:fill="F8FAFC"/>
-            <w:tcMar>
-              <w:top w:w="90" w:type="dxa"/>
-              <w:bottom w:w="90" w:type="dxa"/>
-              <w:left w:w="100" w:type="dxa"/>
-              <w:right w:w="100" w:type="dxa"/>
-            </w:tcMar>
-          </w:tcPr>
-          <w:p>
-            <w:pPr>
-              <w:jc w:val="center"/>
-            </w:pPr>
-            <w:r>
-              <w:rPr>
-                <w:rFonts w:ascii="Calibri" w:hAnsi="Calibri"/>
-                <w:b/>
-                <w:color w:val="0284C7"/>
-                <w:sz w:val="17"/>
-              </w:rPr>
-              <w:t>0.10° (~9 km)</w:t>
-              <w:br/>
-              <w:t>دقة فائقة</w:t>
-            </w:r>
-          </w:p>
-        </w:tc>
-        <w:tc>
-          <w:tcPr>
-            <w:tcW w:type="dxa" w:w="2016"/>
-            <w:shd w:fill="F8FAFC"/>
-            <w:tcMar>
-              <w:top w:w="90" w:type="dxa"/>
-              <w:bottom w:w="90" w:type="dxa"/>
-              <w:left w:w="100" w:type="dxa"/>
-              <w:right w:w="100" w:type="dxa"/>
-            </w:tcMar>
-          </w:tcPr>
-          <w:p>
-            <w:pPr>
-              <w:jc w:val="center"/>
-            </w:pPr>
-            <w:r>
-              <w:rPr>
-                <w:rFonts w:ascii="Calibri" w:hAnsi="Calibri"/>
-                <w:color w:val="1E293B"/>
-                <w:sz w:val="17"/>
-              </w:rPr>
-              <w:t>Gridded ERA5-Land</w:t>
-              <w:br/>
-              <w:t>إعادة تحليل معدلة طبوغرافياً</w:t>
-            </w:r>
-          </w:p>
-        </w:tc>
-        <w:tc>
-          <w:tcPr>
-            <w:tcW w:type="dxa" w:w="1440"/>
-            <w:shd w:fill="F8FAFC"/>
-            <w:tcMar>
-              <w:top w:w="90" w:type="dxa"/>
-              <w:bottom w:w="90" w:type="dxa"/>
-              <w:left w:w="100" w:type="dxa"/>
-              <w:right w:w="100" w:type="dxa"/>
-            </w:tcMar>
-          </w:tcPr>
-          <w:p>
-            <w:pPr>
-              <w:jc w:val="center"/>
-            </w:pPr>
-            <w:r>
-              <w:rPr>
-                <w:rFonts w:ascii="Calibri" w:hAnsi="Calibri"/>
-                <w:color w:val="1E293B"/>
-                <w:sz w:val="17"/>
-              </w:rPr>
-              <w:t>100% Gridded</w:t>
-              <w:br/>
-              <w:t>شبكي مكتمل عالمياً</w:t>
-            </w:r>
-          </w:p>
-        </w:tc>
-      </w:tr>
-      <w:tr>
-        <w:tc>
-          <w:tcPr>
-            <w:tcW w:type="dxa" w:w="3168"/>
-            <w:shd w:fill="FFFFFF"/>
-            <w:tcMar>
-              <w:top w:w="90" w:type="dxa"/>
-              <w:bottom w:w="90" w:type="dxa"/>
-              <w:left w:w="100" w:type="dxa"/>
-              <w:right w:w="100" w:type="dxa"/>
-            </w:tcMar>
-          </w:tcPr>
-          <w:p>
-            <w:pPr>
-              <w:jc w:val="left"/>
-            </w:pPr>
-            <w:r>
-              <w:rPr>
-                <w:rFonts w:ascii="Calibri" w:hAnsi="Calibri"/>
-                <w:color w:val="1E293B"/>
-                <w:sz w:val="17"/>
-              </w:rPr>
-              <w:t>Copernicus Climate Data Store (CDS)</w:t>
-              <w:br/>
-              <w:t>مخزن بيانات كوبرنيكوس الأوروبي</w:t>
-            </w:r>
-          </w:p>
-        </w:tc>
-        <w:tc>
-          <w:tcPr>
-            <w:tcW w:type="dxa" w:w="1296"/>
-            <w:shd w:fill="FFFFFF"/>
-            <w:tcMar>
-              <w:top w:w="90" w:type="dxa"/>
-              <w:bottom w:w="90" w:type="dxa"/>
-              <w:left w:w="100" w:type="dxa"/>
-              <w:right w:w="100" w:type="dxa"/>
-            </w:tcMar>
-          </w:tcPr>
-          <w:p>
-            <w:pPr>
-              <w:jc w:val="center"/>
-            </w:pPr>
-            <w:r>
-              <w:rPr>
-                <w:rFonts w:ascii="Calibri" w:hAnsi="Calibri"/>
-                <w:color w:val="1E293B"/>
-                <w:sz w:val="17"/>
-              </w:rPr>
-              <w:t>1940</w:t>
-              <w:br/>
-              <w:t>(1950 ERA5-L)</w:t>
-            </w:r>
-          </w:p>
-        </w:tc>
-        <w:tc>
-          <w:tcPr>
-            <w:tcW w:type="dxa" w:w="1296"/>
-            <w:shd w:fill="FFFFFF"/>
-            <w:tcMar>
-              <w:top w:w="90" w:type="dxa"/>
-              <w:bottom w:w="90" w:type="dxa"/>
-              <w:left w:w="100" w:type="dxa"/>
-              <w:right w:w="100" w:type="dxa"/>
-            </w:tcMar>
-          </w:tcPr>
-          <w:p>
-            <w:pPr>
-              <w:jc w:val="center"/>
-            </w:pPr>
-            <w:r>
-              <w:rPr>
-                <w:rFonts w:ascii="Calibri" w:hAnsi="Calibri"/>
-                <w:color w:val="1E293B"/>
-                <w:sz w:val="17"/>
-              </w:rPr>
-              <w:t>Present</w:t>
-              <w:br/>
-              <w:t>(2-5 days)</w:t>
-            </w:r>
-          </w:p>
-        </w:tc>
-        <w:tc>
-          <w:tcPr>
-            <w:tcW w:type="dxa" w:w="1584"/>
-            <w:shd w:fill="FFFFFF"/>
-            <w:tcMar>
-              <w:top w:w="90" w:type="dxa"/>
-              <w:bottom w:w="90" w:type="dxa"/>
-              <w:left w:w="100" w:type="dxa"/>
-              <w:right w:w="100" w:type="dxa"/>
-            </w:tcMar>
-          </w:tcPr>
-          <w:p>
-            <w:pPr>
-              <w:jc w:val="center"/>
-            </w:pPr>
-            <w:r>
-              <w:rPr>
-                <w:rFonts w:ascii="Calibri" w:hAnsi="Calibri"/>
-                <w:b/>
-                <w:color w:val="0284C7"/>
-                <w:sz w:val="17"/>
-              </w:rPr>
-              <w:t>0.10° (~9 km)</w:t>
-              <w:br/>
-              <w:t>دقة فائقة</w:t>
-            </w:r>
-          </w:p>
-        </w:tc>
-        <w:tc>
-          <w:tcPr>
-            <w:tcW w:type="dxa" w:w="2016"/>
-            <w:shd w:fill="FFFFFF"/>
-            <w:tcMar>
-              <w:top w:w="90" w:type="dxa"/>
-              <w:bottom w:w="90" w:type="dxa"/>
-              <w:left w:w="100" w:type="dxa"/>
-              <w:right w:w="100" w:type="dxa"/>
-            </w:tcMar>
-          </w:tcPr>
-          <w:p>
-            <w:pPr>
-              <w:jc w:val="center"/>
-            </w:pPr>
-            <w:r>
-              <w:rPr>
-                <w:rFonts w:ascii="Calibri" w:hAnsi="Calibri"/>
-                <w:color w:val="1E293B"/>
-                <w:sz w:val="17"/>
-              </w:rPr>
-              <w:t>Gridded C3S Reanalysis</w:t>
-              <w:br/>
-              <w:t>إعادة تحليل أوروبية معتمدة</w:t>
-            </w:r>
-          </w:p>
-        </w:tc>
-        <w:tc>
-          <w:tcPr>
-            <w:tcW w:type="dxa" w:w="1440"/>
-            <w:shd w:fill="FFFFFF"/>
-            <w:tcMar>
-              <w:top w:w="90" w:type="dxa"/>
-              <w:bottom w:w="90" w:type="dxa"/>
-              <w:left w:w="100" w:type="dxa"/>
-              <w:right w:w="100" w:type="dxa"/>
-            </w:tcMar>
-          </w:tcPr>
-          <w:p>
-            <w:pPr>
-              <w:jc w:val="center"/>
-            </w:pPr>
-            <w:r>
-              <w:rPr>
-                <w:rFonts w:ascii="Calibri" w:hAnsi="Calibri"/>
-                <w:color w:val="1E293B"/>
-                <w:sz w:val="17"/>
-              </w:rPr>
-              <w:t>100% Gridded</w:t>
-              <w:br/>
-              <w:t>شبكي مكتمل عالمياً</w:t>
-            </w:r>
-          </w:p>
-        </w:tc>
-      </w:tr>
-    </w:tbl>
     <w:p>
-      <w:pPr>
-        <w:spacing w:before="320" w:after="120"/>
-      </w:pPr>
       <w:r>
-        <w:rPr>
-          <w:rFonts w:ascii="Arial" w:hAnsi="Arial"/>
-          <w:b/>
-          <w:color w:val="0284C7"/>
-          <w:sz w:val="26"/>
-        </w:rPr>
-        <w:t>2. مصفوفة توفر العناصر المناخية عبر المصادر / Climate Elements Matrix</w:t>
-      </w:r>
-    </w:p>
-    <w:tbl>
-      <w:tblPr>
-        <w:tblW w:type="auto" w:w="0"/>
-        <w:jc w:val="center"/>
-        <w:tblLayout w:type="fixed"/>
-        <w:tblLook w:firstColumn="1" w:firstRow="1" w:lastColumn="0" w:lastRow="0" w:noHBand="0" w:noVBand="1" w:val="04A0"/>
-      </w:tblPr>
-      <w:tblGrid>
-        <w:gridCol w:w="1680"/>
-        <w:gridCol w:w="1680"/>
-        <w:gridCol w:w="1680"/>
-        <w:gridCol w:w="1680"/>
-        <w:gridCol w:w="1680"/>
-        <w:gridCol w:w="1680"/>
-      </w:tblGrid>
-      <w:tr>
-        <w:tc>
-          <w:tcPr>
-            <w:tcW w:type="dxa" w:w="2880"/>
-            <w:shd w:fill="0284C7"/>
-            <w:tcMar>
-              <w:top w:w="100" w:type="dxa"/>
-              <w:bottom w:w="100" w:type="dxa"/>
-              <w:left w:w="70" w:type="dxa"/>
-              <w:right w:w="70" w:type="dxa"/>
-            </w:tcMar>
-          </w:tcPr>
-          <w:p>
-            <w:pPr>
-              <w:jc w:val="center"/>
-            </w:pPr>
-            <w:r>
-              <w:rPr>
-                <w:rFonts w:ascii="Arial" w:hAnsi="Arial"/>
-                <w:b/>
-                <w:color w:val="FFFFFF"/>
-                <w:sz w:val="17"/>
-              </w:rPr>
-              <w:t>العنصر المناخي / Parameter</w:t>
-            </w:r>
-          </w:p>
-        </w:tc>
-        <w:tc>
-          <w:tcPr>
-            <w:tcW w:type="dxa" w:w="1440"/>
-            <w:shd w:fill="0284C7"/>
-            <w:tcMar>
-              <w:top w:w="100" w:type="dxa"/>
-              <w:bottom w:w="100" w:type="dxa"/>
-              <w:left w:w="70" w:type="dxa"/>
-              <w:right w:w="70" w:type="dxa"/>
-            </w:tcMar>
-          </w:tcPr>
-          <w:p>
-            <w:pPr>
-              <w:jc w:val="center"/>
-            </w:pPr>
-            <w:r>
-              <w:rPr>
-                <w:rFonts w:ascii="Arial" w:hAnsi="Arial"/>
-                <w:b/>
-                <w:color w:val="FFFFFF"/>
-                <w:sz w:val="17"/>
-              </w:rPr>
-              <w:t>Hybrid Engine</w:t>
-            </w:r>
-          </w:p>
-        </w:tc>
-        <w:tc>
-          <w:tcPr>
-            <w:tcW w:type="dxa" w:w="1440"/>
-            <w:shd w:fill="0284C7"/>
-            <w:tcMar>
-              <w:top w:w="100" w:type="dxa"/>
-              <w:bottom w:w="100" w:type="dxa"/>
-              <w:left w:w="70" w:type="dxa"/>
-              <w:right w:w="70" w:type="dxa"/>
-            </w:tcMar>
-          </w:tcPr>
-          <w:p>
-            <w:pPr>
-              <w:jc w:val="center"/>
-            </w:pPr>
-            <w:r>
-              <w:rPr>
-                <w:rFonts w:ascii="Arial" w:hAnsi="Arial"/>
-                <w:b/>
-                <w:color w:val="FFFFFF"/>
-                <w:sz w:val="17"/>
-              </w:rPr>
-              <w:t>NOAA ISD</w:t>
-            </w:r>
-          </w:p>
-        </w:tc>
-        <w:tc>
-          <w:tcPr>
-            <w:tcW w:type="dxa" w:w="1440"/>
-            <w:shd w:fill="0284C7"/>
-            <w:tcMar>
-              <w:top w:w="100" w:type="dxa"/>
-              <w:bottom w:w="100" w:type="dxa"/>
-              <w:left w:w="70" w:type="dxa"/>
-              <w:right w:w="70" w:type="dxa"/>
-            </w:tcMar>
-          </w:tcPr>
-          <w:p>
-            <w:pPr>
-              <w:jc w:val="center"/>
-            </w:pPr>
-            <w:r>
-              <w:rPr>
-                <w:rFonts w:ascii="Arial" w:hAnsi="Arial"/>
-                <w:b/>
-                <w:color w:val="FFFFFF"/>
-                <w:sz w:val="17"/>
-              </w:rPr>
-              <w:t>NASA POWER</w:t>
-            </w:r>
-          </w:p>
-        </w:tc>
-        <w:tc>
-          <w:tcPr>
-            <w:tcW w:type="dxa" w:w="1440"/>
-            <w:shd w:fill="0284C7"/>
-            <w:tcMar>
-              <w:top w:w="100" w:type="dxa"/>
-              <w:bottom w:w="100" w:type="dxa"/>
-              <w:left w:w="70" w:type="dxa"/>
-              <w:right w:w="70" w:type="dxa"/>
-            </w:tcMar>
-          </w:tcPr>
-          <w:p>
-            <w:pPr>
-              <w:jc w:val="center"/>
-            </w:pPr>
-            <w:r>
-              <w:rPr>
-                <w:rFonts w:ascii="Arial" w:hAnsi="Arial"/>
-                <w:b/>
-                <w:color w:val="FFFFFF"/>
-                <w:sz w:val="17"/>
-              </w:rPr>
-              <w:t>Open-Meteo</w:t>
-            </w:r>
-          </w:p>
-        </w:tc>
-        <w:tc>
-          <w:tcPr>
-            <w:tcW w:type="dxa" w:w="1440"/>
-            <w:shd w:fill="0284C7"/>
-            <w:tcMar>
-              <w:top w:w="100" w:type="dxa"/>
-              <w:bottom w:w="100" w:type="dxa"/>
-              <w:left w:w="70" w:type="dxa"/>
-              <w:right w:w="70" w:type="dxa"/>
-            </w:tcMar>
-          </w:tcPr>
-          <w:p>
-            <w:pPr>
-              <w:jc w:val="center"/>
-            </w:pPr>
-            <w:r>
-              <w:rPr>
-                <w:rFonts w:ascii="Arial" w:hAnsi="Arial"/>
-                <w:b/>
-                <w:color w:val="FFFFFF"/>
-                <w:sz w:val="17"/>
-              </w:rPr>
-              <w:t>Copernicus CDS</w:t>
-            </w:r>
-          </w:p>
-        </w:tc>
-      </w:tr>
-      <w:tr>
-        <w:tc>
-          <w:tcPr>
-            <w:tcW w:type="dxa" w:w="2880"/>
-            <w:shd w:fill="FFFFFF"/>
-            <w:tcMar>
-              <w:top w:w="70" w:type="dxa"/>
-              <w:bottom w:w="70" w:type="dxa"/>
-              <w:left w:w="70" w:type="dxa"/>
-              <w:right w:w="70" w:type="dxa"/>
-            </w:tcMar>
-          </w:tcPr>
-          <w:p>
-            <w:pPr>
-              <w:jc w:val="left"/>
-            </w:pPr>
-            <w:r>
-              <w:rPr>
-                <w:rFonts w:ascii="Calibri" w:hAnsi="Calibri"/>
-                <w:color w:val="1E293B"/>
-                <w:sz w:val="16"/>
-              </w:rPr>
-              <w:t>درجات حرارة الهواء (T, Tmax, Tmin)</w:t>
-            </w:r>
-          </w:p>
-        </w:tc>
-        <w:tc>
-          <w:tcPr>
-            <w:tcW w:type="dxa" w:w="1440"/>
-            <w:shd w:fill="FFFFFF"/>
-            <w:tcMar>
-              <w:top w:w="70" w:type="dxa"/>
-              <w:bottom w:w="70" w:type="dxa"/>
-              <w:left w:w="70" w:type="dxa"/>
-              <w:right w:w="70" w:type="dxa"/>
-            </w:tcMar>
-          </w:tcPr>
-          <w:p>
-            <w:pPr>
-              <w:jc w:val="center"/>
-            </w:pPr>
-            <w:r>
-              <w:rPr>
-                <w:rFonts w:ascii="Calibri" w:hAnsi="Calibri"/>
-                <w:b/>
-                <w:color w:val="0284C7"/>
-                <w:sz w:val="16"/>
-              </w:rPr>
-              <w:t>نعم (رصد + إكمال)</w:t>
-            </w:r>
-          </w:p>
-        </w:tc>
-        <w:tc>
-          <w:tcPr>
-            <w:tcW w:type="dxa" w:w="1440"/>
-            <w:shd w:fill="FFFFFF"/>
-            <w:tcMar>
-              <w:top w:w="70" w:type="dxa"/>
-              <w:bottom w:w="70" w:type="dxa"/>
-              <w:left w:w="70" w:type="dxa"/>
-              <w:right w:w="70" w:type="dxa"/>
-            </w:tcMar>
-          </w:tcPr>
-          <w:p>
-            <w:pPr>
-              <w:jc w:val="center"/>
-            </w:pPr>
-            <w:r>
-              <w:rPr>
-                <w:rFonts w:ascii="Calibri" w:hAnsi="Calibri"/>
-                <w:color w:val="1E293B"/>
-                <w:sz w:val="16"/>
-              </w:rPr>
-              <w:t>نعم (رصد أجهزة)</w:t>
-            </w:r>
-          </w:p>
-        </w:tc>
-        <w:tc>
-          <w:tcPr>
-            <w:tcW w:type="dxa" w:w="1440"/>
-            <w:shd w:fill="FFFFFF"/>
-            <w:tcMar>
-              <w:top w:w="70" w:type="dxa"/>
-              <w:bottom w:w="70" w:type="dxa"/>
-              <w:left w:w="70" w:type="dxa"/>
-              <w:right w:w="70" w:type="dxa"/>
-            </w:tcMar>
-          </w:tcPr>
-          <w:p>
-            <w:pPr>
-              <w:jc w:val="center"/>
-            </w:pPr>
-            <w:r>
-              <w:rPr>
-                <w:rFonts w:ascii="Calibri" w:hAnsi="Calibri"/>
-                <w:color w:val="1E293B"/>
-                <w:sz w:val="16"/>
-              </w:rPr>
-              <w:t>نعم (MERRA-2)</w:t>
-            </w:r>
-          </w:p>
-        </w:tc>
-        <w:tc>
-          <w:tcPr>
-            <w:tcW w:type="dxa" w:w="1440"/>
-            <w:shd w:fill="FFFFFF"/>
-            <w:tcMar>
-              <w:top w:w="70" w:type="dxa"/>
-              <w:bottom w:w="70" w:type="dxa"/>
-              <w:left w:w="70" w:type="dxa"/>
-              <w:right w:w="70" w:type="dxa"/>
-            </w:tcMar>
-          </w:tcPr>
-          <w:p>
-            <w:pPr>
-              <w:jc w:val="center"/>
-            </w:pPr>
-            <w:r>
-              <w:rPr>
-                <w:rFonts w:ascii="Calibri" w:hAnsi="Calibri"/>
-                <w:color w:val="1E293B"/>
-                <w:sz w:val="16"/>
-              </w:rPr>
-              <w:t>نعم (ERA5-L)</w:t>
-            </w:r>
-          </w:p>
-        </w:tc>
-        <w:tc>
-          <w:tcPr>
-            <w:tcW w:type="dxa" w:w="1440"/>
-            <w:shd w:fill="FFFFFF"/>
-            <w:tcMar>
-              <w:top w:w="70" w:type="dxa"/>
-              <w:bottom w:w="70" w:type="dxa"/>
-              <w:left w:w="70" w:type="dxa"/>
-              <w:right w:w="70" w:type="dxa"/>
-            </w:tcMar>
-          </w:tcPr>
-          <w:p>
-            <w:pPr>
-              <w:jc w:val="center"/>
-            </w:pPr>
-            <w:r>
-              <w:rPr>
-                <w:rFonts w:ascii="Calibri" w:hAnsi="Calibri"/>
-                <w:color w:val="1E293B"/>
-                <w:sz w:val="16"/>
-              </w:rPr>
-              <w:t>نعم (ERA5-L)</w:t>
-            </w:r>
-          </w:p>
-        </w:tc>
-      </w:tr>
-      <w:tr>
-        <w:tc>
-          <w:tcPr>
-            <w:tcW w:type="dxa" w:w="2880"/>
-            <w:shd w:fill="F8FAFC"/>
-            <w:tcMar>
-              <w:top w:w="70" w:type="dxa"/>
-              <w:bottom w:w="70" w:type="dxa"/>
-              <w:left w:w="70" w:type="dxa"/>
-              <w:right w:w="70" w:type="dxa"/>
-            </w:tcMar>
-          </w:tcPr>
-          <w:p>
-            <w:pPr>
-              <w:jc w:val="left"/>
-            </w:pPr>
-            <w:r>
-              <w:rPr>
-                <w:rFonts w:ascii="Calibri" w:hAnsi="Calibri"/>
-                <w:color w:val="1E293B"/>
-                <w:sz w:val="16"/>
-              </w:rPr>
-              <w:t>نقطة الندى والرطوبة النسبية (Td, RH)</w:t>
-            </w:r>
-          </w:p>
-        </w:tc>
-        <w:tc>
-          <w:tcPr>
-            <w:tcW w:type="dxa" w:w="1440"/>
-            <w:shd w:fill="F8FAFC"/>
-            <w:tcMar>
-              <w:top w:w="70" w:type="dxa"/>
-              <w:bottom w:w="70" w:type="dxa"/>
-              <w:left w:w="70" w:type="dxa"/>
-              <w:right w:w="70" w:type="dxa"/>
-            </w:tcMar>
-          </w:tcPr>
-          <w:p>
-            <w:pPr>
-              <w:jc w:val="center"/>
-            </w:pPr>
-            <w:r>
-              <w:rPr>
-                <w:rFonts w:ascii="Calibri" w:hAnsi="Calibri"/>
-                <w:b/>
-                <w:color w:val="0284C7"/>
-                <w:sz w:val="16"/>
-              </w:rPr>
-              <w:t>نعم (رصد + إكمال)</w:t>
-            </w:r>
-          </w:p>
-        </w:tc>
-        <w:tc>
-          <w:tcPr>
-            <w:tcW w:type="dxa" w:w="1440"/>
-            <w:shd w:fill="F8FAFC"/>
-            <w:tcMar>
-              <w:top w:w="70" w:type="dxa"/>
-              <w:bottom w:w="70" w:type="dxa"/>
-              <w:left w:w="70" w:type="dxa"/>
-              <w:right w:w="70" w:type="dxa"/>
-            </w:tcMar>
-          </w:tcPr>
-          <w:p>
-            <w:pPr>
-              <w:jc w:val="center"/>
-            </w:pPr>
-            <w:r>
-              <w:rPr>
-                <w:rFonts w:ascii="Calibri" w:hAnsi="Calibri"/>
-                <w:color w:val="1E293B"/>
-                <w:sz w:val="16"/>
-              </w:rPr>
-              <w:t>نعم (رصد أجهزة)</w:t>
-            </w:r>
-          </w:p>
-        </w:tc>
-        <w:tc>
-          <w:tcPr>
-            <w:tcW w:type="dxa" w:w="1440"/>
-            <w:shd w:fill="F8FAFC"/>
-            <w:tcMar>
-              <w:top w:w="70" w:type="dxa"/>
-              <w:bottom w:w="70" w:type="dxa"/>
-              <w:left w:w="70" w:type="dxa"/>
-              <w:right w:w="70" w:type="dxa"/>
-            </w:tcMar>
-          </w:tcPr>
-          <w:p>
-            <w:pPr>
-              <w:jc w:val="center"/>
-            </w:pPr>
-            <w:r>
-              <w:rPr>
-                <w:rFonts w:ascii="Calibri" w:hAnsi="Calibri"/>
-                <w:color w:val="1E293B"/>
-                <w:sz w:val="16"/>
-              </w:rPr>
-              <w:t>نعم (MERRA-2)</w:t>
-            </w:r>
-          </w:p>
-        </w:tc>
-        <w:tc>
-          <w:tcPr>
-            <w:tcW w:type="dxa" w:w="1440"/>
-            <w:shd w:fill="F8FAFC"/>
-            <w:tcMar>
-              <w:top w:w="70" w:type="dxa"/>
-              <w:bottom w:w="70" w:type="dxa"/>
-              <w:left w:w="70" w:type="dxa"/>
-              <w:right w:w="70" w:type="dxa"/>
-            </w:tcMar>
-          </w:tcPr>
-          <w:p>
-            <w:pPr>
-              <w:jc w:val="center"/>
-            </w:pPr>
-            <w:r>
-              <w:rPr>
-                <w:rFonts w:ascii="Calibri" w:hAnsi="Calibri"/>
-                <w:color w:val="1E293B"/>
-                <w:sz w:val="16"/>
-              </w:rPr>
-              <w:t>نعم (ERA5-L)</w:t>
-            </w:r>
-          </w:p>
-        </w:tc>
-        <w:tc>
-          <w:tcPr>
-            <w:tcW w:type="dxa" w:w="1440"/>
-            <w:shd w:fill="F8FAFC"/>
-            <w:tcMar>
-              <w:top w:w="70" w:type="dxa"/>
-              <w:bottom w:w="70" w:type="dxa"/>
-              <w:left w:w="70" w:type="dxa"/>
-              <w:right w:w="70" w:type="dxa"/>
-            </w:tcMar>
-          </w:tcPr>
-          <w:p>
-            <w:pPr>
-              <w:jc w:val="center"/>
-            </w:pPr>
-            <w:r>
-              <w:rPr>
-                <w:rFonts w:ascii="Calibri" w:hAnsi="Calibri"/>
-                <w:color w:val="1E293B"/>
-                <w:sz w:val="16"/>
-              </w:rPr>
-              <w:t>نعم (ERA5-L)</w:t>
-            </w:r>
-          </w:p>
-        </w:tc>
-      </w:tr>
-      <w:tr>
-        <w:tc>
-          <w:tcPr>
-            <w:tcW w:type="dxa" w:w="2880"/>
-            <w:shd w:fill="FFFFFF"/>
-            <w:tcMar>
-              <w:top w:w="70" w:type="dxa"/>
-              <w:bottom w:w="70" w:type="dxa"/>
-              <w:left w:w="70" w:type="dxa"/>
-              <w:right w:w="70" w:type="dxa"/>
-            </w:tcMar>
-          </w:tcPr>
-          <w:p>
-            <w:pPr>
-              <w:jc w:val="left"/>
-            </w:pPr>
-            <w:r>
-              <w:rPr>
-                <w:rFonts w:ascii="Calibri" w:hAnsi="Calibri"/>
-                <w:color w:val="1E293B"/>
-                <w:sz w:val="16"/>
-              </w:rPr>
-              <w:t>ضغط مستوى سطح البحر (PSL) والآيزوبار</w:t>
-            </w:r>
-          </w:p>
-        </w:tc>
-        <w:tc>
-          <w:tcPr>
-            <w:tcW w:type="dxa" w:w="1440"/>
-            <w:shd w:fill="FFFFFF"/>
-            <w:tcMar>
-              <w:top w:w="70" w:type="dxa"/>
-              <w:bottom w:w="70" w:type="dxa"/>
-              <w:left w:w="70" w:type="dxa"/>
-              <w:right w:w="70" w:type="dxa"/>
-            </w:tcMar>
-          </w:tcPr>
-          <w:p>
-            <w:pPr>
-              <w:jc w:val="center"/>
-            </w:pPr>
-            <w:r>
-              <w:rPr>
-                <w:rFonts w:ascii="Calibri" w:hAnsi="Calibri"/>
-                <w:b/>
-                <w:color w:val="0284C7"/>
-                <w:sz w:val="16"/>
-              </w:rPr>
-              <w:t>نعم (رصد + إكمال)</w:t>
-            </w:r>
-          </w:p>
-        </w:tc>
-        <w:tc>
-          <w:tcPr>
-            <w:tcW w:type="dxa" w:w="1440"/>
-            <w:shd w:fill="FFFFFF"/>
-            <w:tcMar>
-              <w:top w:w="70" w:type="dxa"/>
-              <w:bottom w:w="70" w:type="dxa"/>
-              <w:left w:w="70" w:type="dxa"/>
-              <w:right w:w="70" w:type="dxa"/>
-            </w:tcMar>
-          </w:tcPr>
-          <w:p>
-            <w:pPr>
-              <w:jc w:val="center"/>
-            </w:pPr>
-            <w:r>
-              <w:rPr>
-                <w:rFonts w:ascii="Calibri" w:hAnsi="Calibri"/>
-                <w:color w:val="1E293B"/>
-                <w:sz w:val="16"/>
-              </w:rPr>
-              <w:t>نعم (رصد أجهزة)</w:t>
-            </w:r>
-          </w:p>
-        </w:tc>
-        <w:tc>
-          <w:tcPr>
-            <w:tcW w:type="dxa" w:w="1440"/>
-            <w:shd w:fill="FFFFFF"/>
-            <w:tcMar>
-              <w:top w:w="70" w:type="dxa"/>
-              <w:bottom w:w="70" w:type="dxa"/>
-              <w:left w:w="70" w:type="dxa"/>
-              <w:right w:w="70" w:type="dxa"/>
-            </w:tcMar>
-          </w:tcPr>
-          <w:p>
-            <w:pPr>
-              <w:jc w:val="center"/>
-            </w:pPr>
-            <w:r>
-              <w:rPr>
-                <w:rFonts w:ascii="Calibri" w:hAnsi="Calibri"/>
-                <w:color w:val="1E293B"/>
-                <w:sz w:val="16"/>
-              </w:rPr>
-              <w:t>نعم (Surface PS)</w:t>
-            </w:r>
-          </w:p>
-        </w:tc>
-        <w:tc>
-          <w:tcPr>
-            <w:tcW w:type="dxa" w:w="1440"/>
-            <w:shd w:fill="FFFFFF"/>
-            <w:tcMar>
-              <w:top w:w="70" w:type="dxa"/>
-              <w:bottom w:w="70" w:type="dxa"/>
-              <w:left w:w="70" w:type="dxa"/>
-              <w:right w:w="70" w:type="dxa"/>
-            </w:tcMar>
-          </w:tcPr>
-          <w:p>
-            <w:pPr>
-              <w:jc w:val="center"/>
-            </w:pPr>
-            <w:r>
-              <w:rPr>
-                <w:rFonts w:ascii="Calibri" w:hAnsi="Calibri"/>
-                <w:color w:val="1E293B"/>
-                <w:sz w:val="16"/>
-              </w:rPr>
-              <w:t>نعم (ERA5-L)</w:t>
-            </w:r>
-          </w:p>
-        </w:tc>
-        <w:tc>
-          <w:tcPr>
-            <w:tcW w:type="dxa" w:w="1440"/>
-            <w:shd w:fill="FFFFFF"/>
-            <w:tcMar>
-              <w:top w:w="70" w:type="dxa"/>
-              <w:bottom w:w="70" w:type="dxa"/>
-              <w:left w:w="70" w:type="dxa"/>
-              <w:right w:w="70" w:type="dxa"/>
-            </w:tcMar>
-          </w:tcPr>
-          <w:p>
-            <w:pPr>
-              <w:jc w:val="center"/>
-            </w:pPr>
-            <w:r>
-              <w:rPr>
-                <w:rFonts w:ascii="Calibri" w:hAnsi="Calibri"/>
-                <w:color w:val="1E293B"/>
-                <w:sz w:val="16"/>
-              </w:rPr>
-              <w:t>نعم (ERA5-L)</w:t>
-            </w:r>
-          </w:p>
-        </w:tc>
-      </w:tr>
-      <w:tr>
-        <w:tc>
-          <w:tcPr>
-            <w:tcW w:type="dxa" w:w="2880"/>
-            <w:shd w:fill="F8FAFC"/>
-            <w:tcMar>
-              <w:top w:w="70" w:type="dxa"/>
-              <w:bottom w:w="70" w:type="dxa"/>
-              <w:left w:w="70" w:type="dxa"/>
-              <w:right w:w="70" w:type="dxa"/>
-            </w:tcMar>
-          </w:tcPr>
-          <w:p>
-            <w:pPr>
-              <w:jc w:val="left"/>
-            </w:pPr>
-            <w:r>
-              <w:rPr>
-                <w:rFonts w:ascii="Calibri" w:hAnsi="Calibri"/>
-                <w:color w:val="1E293B"/>
-                <w:sz w:val="16"/>
-              </w:rPr>
-              <w:t>سرعة واتجاه الرياح وعواصفها</w:t>
-            </w:r>
-          </w:p>
-        </w:tc>
-        <w:tc>
-          <w:tcPr>
-            <w:tcW w:type="dxa" w:w="1440"/>
-            <w:shd w:fill="F8FAFC"/>
-            <w:tcMar>
-              <w:top w:w="70" w:type="dxa"/>
-              <w:bottom w:w="70" w:type="dxa"/>
-              <w:left w:w="70" w:type="dxa"/>
-              <w:right w:w="70" w:type="dxa"/>
-            </w:tcMar>
-          </w:tcPr>
-          <w:p>
-            <w:pPr>
-              <w:jc w:val="center"/>
-            </w:pPr>
-            <w:r>
-              <w:rPr>
-                <w:rFonts w:ascii="Calibri" w:hAnsi="Calibri"/>
-                <w:b/>
-                <w:color w:val="0284C7"/>
-                <w:sz w:val="16"/>
-              </w:rPr>
-              <w:t>نعم (رصد + إكمال)</w:t>
-            </w:r>
-          </w:p>
-        </w:tc>
-        <w:tc>
-          <w:tcPr>
-            <w:tcW w:type="dxa" w:w="1440"/>
-            <w:shd w:fill="F8FAFC"/>
-            <w:tcMar>
-              <w:top w:w="70" w:type="dxa"/>
-              <w:bottom w:w="70" w:type="dxa"/>
-              <w:left w:w="70" w:type="dxa"/>
-              <w:right w:w="70" w:type="dxa"/>
-            </w:tcMar>
-          </w:tcPr>
-          <w:p>
-            <w:pPr>
-              <w:jc w:val="center"/>
-            </w:pPr>
-            <w:r>
-              <w:rPr>
-                <w:rFonts w:ascii="Calibri" w:hAnsi="Calibri"/>
-                <w:color w:val="1E293B"/>
-                <w:sz w:val="16"/>
-              </w:rPr>
-              <w:t>نعم (رصد أجهزة)</w:t>
-            </w:r>
-          </w:p>
-        </w:tc>
-        <w:tc>
-          <w:tcPr>
-            <w:tcW w:type="dxa" w:w="1440"/>
-            <w:shd w:fill="F8FAFC"/>
-            <w:tcMar>
-              <w:top w:w="70" w:type="dxa"/>
-              <w:bottom w:w="70" w:type="dxa"/>
-              <w:left w:w="70" w:type="dxa"/>
-              <w:right w:w="70" w:type="dxa"/>
-            </w:tcMar>
-          </w:tcPr>
-          <w:p>
-            <w:pPr>
-              <w:jc w:val="center"/>
-            </w:pPr>
-            <w:r>
-              <w:rPr>
-                <w:rFonts w:ascii="Calibri" w:hAnsi="Calibri"/>
-                <w:color w:val="1E293B"/>
-                <w:sz w:val="16"/>
-              </w:rPr>
-              <w:t>نعم (MERRA-2)</w:t>
-            </w:r>
-          </w:p>
-        </w:tc>
-        <w:tc>
-          <w:tcPr>
-            <w:tcW w:type="dxa" w:w="1440"/>
-            <w:shd w:fill="F8FAFC"/>
-            <w:tcMar>
-              <w:top w:w="70" w:type="dxa"/>
-              <w:bottom w:w="70" w:type="dxa"/>
-              <w:left w:w="70" w:type="dxa"/>
-              <w:right w:w="70" w:type="dxa"/>
-            </w:tcMar>
-          </w:tcPr>
-          <w:p>
-            <w:pPr>
-              <w:jc w:val="center"/>
-            </w:pPr>
-            <w:r>
-              <w:rPr>
-                <w:rFonts w:ascii="Calibri" w:hAnsi="Calibri"/>
-                <w:color w:val="1E293B"/>
-                <w:sz w:val="16"/>
-              </w:rPr>
-              <w:t>نعم (ERA5-L)</w:t>
-            </w:r>
-          </w:p>
-        </w:tc>
-        <w:tc>
-          <w:tcPr>
-            <w:tcW w:type="dxa" w:w="1440"/>
-            <w:shd w:fill="F8FAFC"/>
-            <w:tcMar>
-              <w:top w:w="70" w:type="dxa"/>
-              <w:bottom w:w="70" w:type="dxa"/>
-              <w:left w:w="70" w:type="dxa"/>
-              <w:right w:w="70" w:type="dxa"/>
-            </w:tcMar>
-          </w:tcPr>
-          <w:p>
-            <w:pPr>
-              <w:jc w:val="center"/>
-            </w:pPr>
-            <w:r>
-              <w:rPr>
-                <w:rFonts w:ascii="Calibri" w:hAnsi="Calibri"/>
-                <w:color w:val="1E293B"/>
-                <w:sz w:val="16"/>
-              </w:rPr>
-              <w:t>نعم (ERA5-L)</w:t>
-            </w:r>
-          </w:p>
-        </w:tc>
-      </w:tr>
-      <w:tr>
-        <w:tc>
-          <w:tcPr>
-            <w:tcW w:type="dxa" w:w="2880"/>
-            <w:shd w:fill="FFFFFF"/>
-            <w:tcMar>
-              <w:top w:w="70" w:type="dxa"/>
-              <w:bottom w:w="70" w:type="dxa"/>
-              <w:left w:w="70" w:type="dxa"/>
-              <w:right w:w="70" w:type="dxa"/>
-            </w:tcMar>
-          </w:tcPr>
-          <w:p>
-            <w:pPr>
-              <w:jc w:val="left"/>
-            </w:pPr>
-            <w:r>
-              <w:rPr>
-                <w:rFonts w:ascii="Calibri" w:hAnsi="Calibri"/>
-                <w:color w:val="1E293B"/>
-                <w:sz w:val="16"/>
-              </w:rPr>
-              <w:t>الأمطار التراكمية ومعدلات الهطول</w:t>
-            </w:r>
-          </w:p>
-        </w:tc>
-        <w:tc>
-          <w:tcPr>
-            <w:tcW w:type="dxa" w:w="1440"/>
-            <w:shd w:fill="FFFFFF"/>
-            <w:tcMar>
-              <w:top w:w="70" w:type="dxa"/>
-              <w:bottom w:w="70" w:type="dxa"/>
-              <w:left w:w="70" w:type="dxa"/>
-              <w:right w:w="70" w:type="dxa"/>
-            </w:tcMar>
-          </w:tcPr>
-          <w:p>
-            <w:pPr>
-              <w:jc w:val="center"/>
-            </w:pPr>
-            <w:r>
-              <w:rPr>
-                <w:rFonts w:ascii="Calibri" w:hAnsi="Calibri"/>
-                <w:b/>
-                <w:color w:val="0284C7"/>
-                <w:sz w:val="16"/>
-              </w:rPr>
-              <w:t>نعم (رصد + إكمال)</w:t>
-            </w:r>
-          </w:p>
-        </w:tc>
-        <w:tc>
-          <w:tcPr>
-            <w:tcW w:type="dxa" w:w="1440"/>
-            <w:shd w:fill="FFFFFF"/>
-            <w:tcMar>
-              <w:top w:w="70" w:type="dxa"/>
-              <w:bottom w:w="70" w:type="dxa"/>
-              <w:left w:w="70" w:type="dxa"/>
-              <w:right w:w="70" w:type="dxa"/>
-            </w:tcMar>
-          </w:tcPr>
-          <w:p>
-            <w:pPr>
-              <w:jc w:val="center"/>
-            </w:pPr>
-            <w:r>
-              <w:rPr>
-                <w:rFonts w:ascii="Calibri" w:hAnsi="Calibri"/>
-                <w:color w:val="1E293B"/>
-                <w:sz w:val="16"/>
-              </w:rPr>
-              <w:t>نعم (رصد أجهزة)</w:t>
-            </w:r>
-          </w:p>
-        </w:tc>
-        <w:tc>
-          <w:tcPr>
-            <w:tcW w:type="dxa" w:w="1440"/>
-            <w:shd w:fill="FFFFFF"/>
-            <w:tcMar>
-              <w:top w:w="70" w:type="dxa"/>
-              <w:bottom w:w="70" w:type="dxa"/>
-              <w:left w:w="70" w:type="dxa"/>
-              <w:right w:w="70" w:type="dxa"/>
-            </w:tcMar>
-          </w:tcPr>
-          <w:p>
-            <w:pPr>
-              <w:jc w:val="center"/>
-            </w:pPr>
-            <w:r>
-              <w:rPr>
-                <w:rFonts w:ascii="Calibri" w:hAnsi="Calibri"/>
-                <w:color w:val="1E293B"/>
-                <w:sz w:val="16"/>
-              </w:rPr>
-              <w:t>نعم (MERRA-2)</w:t>
-            </w:r>
-          </w:p>
-        </w:tc>
-        <w:tc>
-          <w:tcPr>
-            <w:tcW w:type="dxa" w:w="1440"/>
-            <w:shd w:fill="FFFFFF"/>
-            <w:tcMar>
-              <w:top w:w="70" w:type="dxa"/>
-              <w:bottom w:w="70" w:type="dxa"/>
-              <w:left w:w="70" w:type="dxa"/>
-              <w:right w:w="70" w:type="dxa"/>
-            </w:tcMar>
-          </w:tcPr>
-          <w:p>
-            <w:pPr>
-              <w:jc w:val="center"/>
-            </w:pPr>
-            <w:r>
-              <w:rPr>
-                <w:rFonts w:ascii="Calibri" w:hAnsi="Calibri"/>
-                <w:color w:val="1E293B"/>
-                <w:sz w:val="16"/>
-              </w:rPr>
-              <w:t>نعم (ERA5-L)</w:t>
-            </w:r>
-          </w:p>
-        </w:tc>
-        <w:tc>
-          <w:tcPr>
-            <w:tcW w:type="dxa" w:w="1440"/>
-            <w:shd w:fill="FFFFFF"/>
-            <w:tcMar>
-              <w:top w:w="70" w:type="dxa"/>
-              <w:bottom w:w="70" w:type="dxa"/>
-              <w:left w:w="70" w:type="dxa"/>
-              <w:right w:w="70" w:type="dxa"/>
-            </w:tcMar>
-          </w:tcPr>
-          <w:p>
-            <w:pPr>
-              <w:jc w:val="center"/>
-            </w:pPr>
-            <w:r>
-              <w:rPr>
-                <w:rFonts w:ascii="Calibri" w:hAnsi="Calibri"/>
-                <w:color w:val="1E293B"/>
-                <w:sz w:val="16"/>
-              </w:rPr>
-              <w:t>نعم (ERA5-L)</w:t>
-            </w:r>
-          </w:p>
-        </w:tc>
-      </w:tr>
-      <w:tr>
-        <w:tc>
-          <w:tcPr>
-            <w:tcW w:type="dxa" w:w="2880"/>
-            <w:shd w:fill="F8FAFC"/>
-            <w:tcMar>
-              <w:top w:w="70" w:type="dxa"/>
-              <w:bottom w:w="70" w:type="dxa"/>
-              <w:left w:w="70" w:type="dxa"/>
-              <w:right w:w="70" w:type="dxa"/>
-            </w:tcMar>
-          </w:tcPr>
-          <w:p>
-            <w:pPr>
-              <w:jc w:val="left"/>
-            </w:pPr>
-            <w:r>
-              <w:rPr>
-                <w:rFonts w:ascii="Calibri" w:hAnsi="Calibri"/>
-                <w:color w:val="1E293B"/>
-                <w:sz w:val="16"/>
-              </w:rPr>
-              <w:t>الغطاء السحابي بالأثمان والنسبة</w:t>
-            </w:r>
-          </w:p>
-        </w:tc>
-        <w:tc>
-          <w:tcPr>
-            <w:tcW w:type="dxa" w:w="1440"/>
-            <w:shd w:fill="F8FAFC"/>
-            <w:tcMar>
-              <w:top w:w="70" w:type="dxa"/>
-              <w:bottom w:w="70" w:type="dxa"/>
-              <w:left w:w="70" w:type="dxa"/>
-              <w:right w:w="70" w:type="dxa"/>
-            </w:tcMar>
-          </w:tcPr>
-          <w:p>
-            <w:pPr>
-              <w:jc w:val="center"/>
-            </w:pPr>
-            <w:r>
-              <w:rPr>
-                <w:rFonts w:ascii="Calibri" w:hAnsi="Calibri"/>
-                <w:b/>
-                <w:color w:val="0284C7"/>
-                <w:sz w:val="16"/>
-              </w:rPr>
-              <w:t>نعم (رصد + إكمال)</w:t>
-            </w:r>
-          </w:p>
-        </w:tc>
-        <w:tc>
-          <w:tcPr>
-            <w:tcW w:type="dxa" w:w="1440"/>
-            <w:shd w:fill="F8FAFC"/>
-            <w:tcMar>
-              <w:top w:w="70" w:type="dxa"/>
-              <w:bottom w:w="70" w:type="dxa"/>
-              <w:left w:w="70" w:type="dxa"/>
-              <w:right w:w="70" w:type="dxa"/>
-            </w:tcMar>
-          </w:tcPr>
-          <w:p>
-            <w:pPr>
-              <w:jc w:val="center"/>
-            </w:pPr>
-            <w:r>
-              <w:rPr>
-                <w:rFonts w:ascii="Calibri" w:hAnsi="Calibri"/>
-                <w:color w:val="1E293B"/>
-                <w:sz w:val="16"/>
-              </w:rPr>
-              <w:t>نعم (رصد أجهزة)</w:t>
-            </w:r>
-          </w:p>
-        </w:tc>
-        <w:tc>
-          <w:tcPr>
-            <w:tcW w:type="dxa" w:w="1440"/>
-            <w:shd w:fill="F8FAFC"/>
-            <w:tcMar>
-              <w:top w:w="70" w:type="dxa"/>
-              <w:bottom w:w="70" w:type="dxa"/>
-              <w:left w:w="70" w:type="dxa"/>
-              <w:right w:w="70" w:type="dxa"/>
-            </w:tcMar>
-          </w:tcPr>
-          <w:p>
-            <w:pPr>
-              <w:jc w:val="center"/>
-            </w:pPr>
-            <w:r>
-              <w:rPr>
-                <w:rFonts w:ascii="Calibri" w:hAnsi="Calibri"/>
-                <w:color w:val="1E293B"/>
-                <w:sz w:val="16"/>
-              </w:rPr>
-              <w:t>نعم (MERRA-2)</w:t>
-            </w:r>
-          </w:p>
-        </w:tc>
-        <w:tc>
-          <w:tcPr>
-            <w:tcW w:type="dxa" w:w="1440"/>
-            <w:shd w:fill="F8FAFC"/>
-            <w:tcMar>
-              <w:top w:w="70" w:type="dxa"/>
-              <w:bottom w:w="70" w:type="dxa"/>
-              <w:left w:w="70" w:type="dxa"/>
-              <w:right w:w="70" w:type="dxa"/>
-            </w:tcMar>
-          </w:tcPr>
-          <w:p>
-            <w:pPr>
-              <w:jc w:val="center"/>
-            </w:pPr>
-            <w:r>
-              <w:rPr>
-                <w:rFonts w:ascii="Calibri" w:hAnsi="Calibri"/>
-                <w:color w:val="1E293B"/>
-                <w:sz w:val="16"/>
-              </w:rPr>
-              <w:t>نعم (ERA5-L)</w:t>
-            </w:r>
-          </w:p>
-        </w:tc>
-        <w:tc>
-          <w:tcPr>
-            <w:tcW w:type="dxa" w:w="1440"/>
-            <w:shd w:fill="F8FAFC"/>
-            <w:tcMar>
-              <w:top w:w="70" w:type="dxa"/>
-              <w:bottom w:w="70" w:type="dxa"/>
-              <w:left w:w="70" w:type="dxa"/>
-              <w:right w:w="70" w:type="dxa"/>
-            </w:tcMar>
-          </w:tcPr>
-          <w:p>
-            <w:pPr>
-              <w:jc w:val="center"/>
-            </w:pPr>
-            <w:r>
-              <w:rPr>
-                <w:rFonts w:ascii="Calibri" w:hAnsi="Calibri"/>
-                <w:color w:val="1E293B"/>
-                <w:sz w:val="16"/>
-              </w:rPr>
-              <w:t>نعم (ERA5-L)</w:t>
-            </w:r>
-          </w:p>
-        </w:tc>
-      </w:tr>
-      <w:tr>
-        <w:tc>
-          <w:tcPr>
-            <w:tcW w:type="dxa" w:w="2880"/>
-            <w:shd w:fill="FFFFFF"/>
-            <w:tcMar>
-              <w:top w:w="70" w:type="dxa"/>
-              <w:bottom w:w="70" w:type="dxa"/>
-              <w:left w:w="70" w:type="dxa"/>
-              <w:right w:w="70" w:type="dxa"/>
-            </w:tcMar>
-          </w:tcPr>
-          <w:p>
-            <w:pPr>
-              <w:jc w:val="left"/>
-            </w:pPr>
-            <w:r>
-              <w:rPr>
-                <w:rFonts w:ascii="Calibri" w:hAnsi="Calibri"/>
-                <w:color w:val="1E293B"/>
-                <w:sz w:val="16"/>
-              </w:rPr>
-              <w:t>الإشعاع الشمسي الكلي (GHI / DNI)</w:t>
-            </w:r>
-          </w:p>
-        </w:tc>
-        <w:tc>
-          <w:tcPr>
-            <w:tcW w:type="dxa" w:w="1440"/>
-            <w:shd w:fill="FFFFFF"/>
-            <w:tcMar>
-              <w:top w:w="70" w:type="dxa"/>
-              <w:bottom w:w="70" w:type="dxa"/>
-              <w:left w:w="70" w:type="dxa"/>
-              <w:right w:w="70" w:type="dxa"/>
-            </w:tcMar>
-          </w:tcPr>
-          <w:p>
-            <w:pPr>
-              <w:jc w:val="center"/>
-            </w:pPr>
-            <w:r>
-              <w:rPr>
-                <w:rFonts w:ascii="Calibri" w:hAnsi="Calibri"/>
-                <w:b/>
-                <w:color w:val="0284C7"/>
-                <w:sz w:val="16"/>
-              </w:rPr>
-              <w:t>نعم (دمج CERES)</w:t>
-            </w:r>
-          </w:p>
-        </w:tc>
-        <w:tc>
-          <w:tcPr>
-            <w:tcW w:type="dxa" w:w="1440"/>
-            <w:shd w:fill="FFFFFF"/>
-            <w:tcMar>
-              <w:top w:w="70" w:type="dxa"/>
-              <w:bottom w:w="70" w:type="dxa"/>
-              <w:left w:w="70" w:type="dxa"/>
-              <w:right w:w="70" w:type="dxa"/>
-            </w:tcMar>
-          </w:tcPr>
-          <w:p>
-            <w:pPr>
-              <w:jc w:val="center"/>
-            </w:pPr>
-            <w:r>
-              <w:rPr>
-                <w:rFonts w:ascii="Calibri" w:hAnsi="Calibri"/>
-                <w:color w:val="DC2626"/>
-                <w:sz w:val="16"/>
-              </w:rPr>
-              <w:t>غير متوفر</w:t>
-            </w:r>
-          </w:p>
-        </w:tc>
-        <w:tc>
-          <w:tcPr>
-            <w:tcW w:type="dxa" w:w="1440"/>
-            <w:shd w:fill="FFFFFF"/>
-            <w:tcMar>
-              <w:top w:w="70" w:type="dxa"/>
-              <w:bottom w:w="70" w:type="dxa"/>
-              <w:left w:w="70" w:type="dxa"/>
-              <w:right w:w="70" w:type="dxa"/>
-            </w:tcMar>
-          </w:tcPr>
-          <w:p>
-            <w:pPr>
-              <w:jc w:val="center"/>
-            </w:pPr>
-            <w:r>
-              <w:rPr>
-                <w:rFonts w:ascii="Calibri" w:hAnsi="Calibri"/>
-                <w:color w:val="1E293B"/>
-                <w:sz w:val="16"/>
-              </w:rPr>
-              <w:t>نعم (المعيار الذهبي)</w:t>
-            </w:r>
-          </w:p>
-        </w:tc>
-        <w:tc>
-          <w:tcPr>
-            <w:tcW w:type="dxa" w:w="1440"/>
-            <w:shd w:fill="FFFFFF"/>
-            <w:tcMar>
-              <w:top w:w="70" w:type="dxa"/>
-              <w:bottom w:w="70" w:type="dxa"/>
-              <w:left w:w="70" w:type="dxa"/>
-              <w:right w:w="70" w:type="dxa"/>
-            </w:tcMar>
-          </w:tcPr>
-          <w:p>
-            <w:pPr>
-              <w:jc w:val="center"/>
-            </w:pPr>
-            <w:r>
-              <w:rPr>
-                <w:rFonts w:ascii="Calibri" w:hAnsi="Calibri"/>
-                <w:color w:val="1E293B"/>
-                <w:sz w:val="16"/>
-              </w:rPr>
-              <w:t>نعم (نمذجة)</w:t>
-            </w:r>
-          </w:p>
-        </w:tc>
-        <w:tc>
-          <w:tcPr>
-            <w:tcW w:type="dxa" w:w="1440"/>
-            <w:shd w:fill="FFFFFF"/>
-            <w:tcMar>
-              <w:top w:w="70" w:type="dxa"/>
-              <w:bottom w:w="70" w:type="dxa"/>
-              <w:left w:w="70" w:type="dxa"/>
-              <w:right w:w="70" w:type="dxa"/>
-            </w:tcMar>
-          </w:tcPr>
-          <w:p>
-            <w:pPr>
-              <w:jc w:val="center"/>
-            </w:pPr>
-            <w:r>
-              <w:rPr>
-                <w:rFonts w:ascii="Calibri" w:hAnsi="Calibri"/>
-                <w:color w:val="1E293B"/>
-                <w:sz w:val="16"/>
-              </w:rPr>
-              <w:t>نعم (نمذجة)</w:t>
-            </w:r>
-          </w:p>
-        </w:tc>
-      </w:tr>
-      <w:tr>
-        <w:tc>
-          <w:tcPr>
-            <w:tcW w:type="dxa" w:w="2880"/>
-            <w:shd w:fill="F8FAFC"/>
-            <w:tcMar>
-              <w:top w:w="70" w:type="dxa"/>
-              <w:bottom w:w="70" w:type="dxa"/>
-              <w:left w:w="70" w:type="dxa"/>
-              <w:right w:w="70" w:type="dxa"/>
-            </w:tcMar>
-          </w:tcPr>
-          <w:p>
-            <w:pPr>
-              <w:jc w:val="left"/>
-            </w:pPr>
-            <w:r>
-              <w:rPr>
-                <w:rFonts w:ascii="Calibri" w:hAnsi="Calibri"/>
-                <w:color w:val="1E293B"/>
-                <w:sz w:val="16"/>
-              </w:rPr>
-              <w:t>مؤشر الأشعة فوق البنفسجية (UV Index)</w:t>
-            </w:r>
-          </w:p>
-        </w:tc>
-        <w:tc>
-          <w:tcPr>
-            <w:tcW w:type="dxa" w:w="1440"/>
-            <w:shd w:fill="F8FAFC"/>
-            <w:tcMar>
-              <w:top w:w="70" w:type="dxa"/>
-              <w:bottom w:w="70" w:type="dxa"/>
-              <w:left w:w="70" w:type="dxa"/>
-              <w:right w:w="70" w:type="dxa"/>
-            </w:tcMar>
-          </w:tcPr>
-          <w:p>
-            <w:pPr>
-              <w:jc w:val="center"/>
-            </w:pPr>
-            <w:r>
-              <w:rPr>
-                <w:rFonts w:ascii="Calibri" w:hAnsi="Calibri"/>
-                <w:b/>
-                <w:color w:val="0284C7"/>
-                <w:sz w:val="16"/>
-              </w:rPr>
-              <w:t>نعم (دمج FLASHFlux)</w:t>
-            </w:r>
-          </w:p>
-        </w:tc>
-        <w:tc>
-          <w:tcPr>
-            <w:tcW w:type="dxa" w:w="1440"/>
-            <w:shd w:fill="F8FAFC"/>
-            <w:tcMar>
-              <w:top w:w="70" w:type="dxa"/>
-              <w:bottom w:w="70" w:type="dxa"/>
-              <w:left w:w="70" w:type="dxa"/>
-              <w:right w:w="70" w:type="dxa"/>
-            </w:tcMar>
-          </w:tcPr>
-          <w:p>
-            <w:pPr>
-              <w:jc w:val="center"/>
-            </w:pPr>
-            <w:r>
-              <w:rPr>
-                <w:rFonts w:ascii="Calibri" w:hAnsi="Calibri"/>
-                <w:color w:val="DC2626"/>
-                <w:sz w:val="16"/>
-              </w:rPr>
-              <w:t>غير متوفر</w:t>
-            </w:r>
-          </w:p>
-        </w:tc>
-        <w:tc>
-          <w:tcPr>
-            <w:tcW w:type="dxa" w:w="1440"/>
-            <w:shd w:fill="F8FAFC"/>
-            <w:tcMar>
-              <w:top w:w="70" w:type="dxa"/>
-              <w:bottom w:w="70" w:type="dxa"/>
-              <w:left w:w="70" w:type="dxa"/>
-              <w:right w:w="70" w:type="dxa"/>
-            </w:tcMar>
-          </w:tcPr>
-          <w:p>
-            <w:pPr>
-              <w:jc w:val="center"/>
-            </w:pPr>
-            <w:r>
-              <w:rPr>
-                <w:rFonts w:ascii="Calibri" w:hAnsi="Calibri"/>
-                <w:color w:val="1E293B"/>
-                <w:sz w:val="16"/>
-              </w:rPr>
-              <w:t>نعم (مستشعر فضائي)</w:t>
-            </w:r>
-          </w:p>
-        </w:tc>
-        <w:tc>
-          <w:tcPr>
-            <w:tcW w:type="dxa" w:w="1440"/>
-            <w:shd w:fill="F8FAFC"/>
-            <w:tcMar>
-              <w:top w:w="70" w:type="dxa"/>
-              <w:bottom w:w="70" w:type="dxa"/>
-              <w:left w:w="70" w:type="dxa"/>
-              <w:right w:w="70" w:type="dxa"/>
-            </w:tcMar>
-          </w:tcPr>
-          <w:p>
-            <w:pPr>
-              <w:jc w:val="center"/>
-            </w:pPr>
-            <w:r>
-              <w:rPr>
-                <w:rFonts w:ascii="Calibri" w:hAnsi="Calibri"/>
-                <w:color w:val="1E293B"/>
-                <w:sz w:val="16"/>
-              </w:rPr>
-              <w:t>تقديري</w:t>
-            </w:r>
-          </w:p>
-        </w:tc>
-        <w:tc>
-          <w:tcPr>
-            <w:tcW w:type="dxa" w:w="1440"/>
-            <w:shd w:fill="F8FAFC"/>
-            <w:tcMar>
-              <w:top w:w="70" w:type="dxa"/>
-              <w:bottom w:w="70" w:type="dxa"/>
-              <w:left w:w="70" w:type="dxa"/>
-              <w:right w:w="70" w:type="dxa"/>
-            </w:tcMar>
-          </w:tcPr>
-          <w:p>
-            <w:pPr>
-              <w:jc w:val="center"/>
-            </w:pPr>
-            <w:r>
-              <w:rPr>
-                <w:rFonts w:ascii="Calibri" w:hAnsi="Calibri"/>
-                <w:color w:val="1E293B"/>
-                <w:sz w:val="16"/>
-              </w:rPr>
-              <w:t>تقديري</w:t>
-            </w:r>
-          </w:p>
-        </w:tc>
-      </w:tr>
-      <w:tr>
-        <w:tc>
-          <w:tcPr>
-            <w:tcW w:type="dxa" w:w="2880"/>
-            <w:shd w:fill="FFFFFF"/>
-            <w:tcMar>
-              <w:top w:w="70" w:type="dxa"/>
-              <w:bottom w:w="70" w:type="dxa"/>
-              <w:left w:w="70" w:type="dxa"/>
-              <w:right w:w="70" w:type="dxa"/>
-            </w:tcMar>
-          </w:tcPr>
-          <w:p>
-            <w:pPr>
-              <w:jc w:val="left"/>
-            </w:pPr>
-            <w:r>
-              <w:rPr>
-                <w:rFonts w:ascii="Calibri" w:hAnsi="Calibri"/>
-                <w:color w:val="1E293B"/>
-                <w:sz w:val="16"/>
-              </w:rPr>
-              <w:t>حرارة سطح الأرض الإشعاعية (LST)</w:t>
-            </w:r>
-          </w:p>
-        </w:tc>
-        <w:tc>
-          <w:tcPr>
-            <w:tcW w:type="dxa" w:w="1440"/>
-            <w:shd w:fill="FFFFFF"/>
-            <w:tcMar>
-              <w:top w:w="70" w:type="dxa"/>
-              <w:bottom w:w="70" w:type="dxa"/>
-              <w:left w:w="70" w:type="dxa"/>
-              <w:right w:w="70" w:type="dxa"/>
-            </w:tcMar>
-          </w:tcPr>
-          <w:p>
-            <w:pPr>
-              <w:jc w:val="center"/>
-            </w:pPr>
-            <w:r>
-              <w:rPr>
-                <w:rFonts w:ascii="Calibri" w:hAnsi="Calibri"/>
-                <w:b/>
-                <w:color w:val="0284C7"/>
-                <w:sz w:val="16"/>
-              </w:rPr>
-              <w:t>نعم (دمج فضائي)</w:t>
-            </w:r>
-          </w:p>
-        </w:tc>
-        <w:tc>
-          <w:tcPr>
-            <w:tcW w:type="dxa" w:w="1440"/>
-            <w:shd w:fill="FFFFFF"/>
-            <w:tcMar>
-              <w:top w:w="70" w:type="dxa"/>
-              <w:bottom w:w="70" w:type="dxa"/>
-              <w:left w:w="70" w:type="dxa"/>
-              <w:right w:w="70" w:type="dxa"/>
-            </w:tcMar>
-          </w:tcPr>
-          <w:p>
-            <w:pPr>
-              <w:jc w:val="center"/>
-            </w:pPr>
-            <w:r>
-              <w:rPr>
-                <w:rFonts w:ascii="Calibri" w:hAnsi="Calibri"/>
-                <w:color w:val="DC2626"/>
-                <w:sz w:val="16"/>
-              </w:rPr>
-              <w:t>غير متوفر</w:t>
-            </w:r>
-          </w:p>
-        </w:tc>
-        <w:tc>
-          <w:tcPr>
-            <w:tcW w:type="dxa" w:w="1440"/>
-            <w:shd w:fill="FFFFFF"/>
-            <w:tcMar>
-              <w:top w:w="70" w:type="dxa"/>
-              <w:bottom w:w="70" w:type="dxa"/>
-              <w:left w:w="70" w:type="dxa"/>
-              <w:right w:w="70" w:type="dxa"/>
-            </w:tcMar>
-          </w:tcPr>
-          <w:p>
-            <w:pPr>
-              <w:jc w:val="center"/>
-            </w:pPr>
-            <w:r>
-              <w:rPr>
-                <w:rFonts w:ascii="Calibri" w:hAnsi="Calibri"/>
-                <w:color w:val="1E293B"/>
-                <w:sz w:val="16"/>
-              </w:rPr>
-              <w:t>نعم (MERRA-2 Skin)</w:t>
-            </w:r>
-          </w:p>
-        </w:tc>
-        <w:tc>
-          <w:tcPr>
-            <w:tcW w:type="dxa" w:w="1440"/>
-            <w:shd w:fill="FFFFFF"/>
-            <w:tcMar>
-              <w:top w:w="70" w:type="dxa"/>
-              <w:bottom w:w="70" w:type="dxa"/>
-              <w:left w:w="70" w:type="dxa"/>
-              <w:right w:w="70" w:type="dxa"/>
-            </w:tcMar>
-          </w:tcPr>
-          <w:p>
-            <w:pPr>
-              <w:jc w:val="center"/>
-            </w:pPr>
-            <w:r>
-              <w:rPr>
-                <w:rFonts w:ascii="Calibri" w:hAnsi="Calibri"/>
-                <w:color w:val="1E293B"/>
-                <w:sz w:val="16"/>
-              </w:rPr>
-              <w:t>نعم (ERA5 Skin)</w:t>
-            </w:r>
-          </w:p>
-        </w:tc>
-        <w:tc>
-          <w:tcPr>
-            <w:tcW w:type="dxa" w:w="1440"/>
-            <w:shd w:fill="FFFFFF"/>
-            <w:tcMar>
-              <w:top w:w="70" w:type="dxa"/>
-              <w:bottom w:w="70" w:type="dxa"/>
-              <w:left w:w="70" w:type="dxa"/>
-              <w:right w:w="70" w:type="dxa"/>
-            </w:tcMar>
-          </w:tcPr>
-          <w:p>
-            <w:pPr>
-              <w:jc w:val="center"/>
-            </w:pPr>
-            <w:r>
-              <w:rPr>
-                <w:rFonts w:ascii="Calibri" w:hAnsi="Calibri"/>
-                <w:color w:val="1E293B"/>
-                <w:sz w:val="16"/>
-              </w:rPr>
-              <w:t>نعم (ERA5 Skin)</w:t>
-            </w:r>
-          </w:p>
-        </w:tc>
-      </w:tr>
-      <w:tr>
-        <w:tc>
-          <w:tcPr>
-            <w:tcW w:type="dxa" w:w="2880"/>
-            <w:shd w:fill="F8FAFC"/>
-            <w:tcMar>
-              <w:top w:w="70" w:type="dxa"/>
-              <w:bottom w:w="70" w:type="dxa"/>
-              <w:left w:w="70" w:type="dxa"/>
-              <w:right w:w="70" w:type="dxa"/>
-            </w:tcMar>
-          </w:tcPr>
-          <w:p>
-            <w:pPr>
-              <w:jc w:val="left"/>
-            </w:pPr>
-            <w:r>
-              <w:rPr>
-                <w:rFonts w:ascii="Calibri" w:hAnsi="Calibri"/>
-                <w:color w:val="1E293B"/>
-                <w:sz w:val="16"/>
-              </w:rPr>
-              <w:t>حرارة ورطوبة التربة (4 أعماق)</w:t>
-            </w:r>
-          </w:p>
-        </w:tc>
-        <w:tc>
-          <w:tcPr>
-            <w:tcW w:type="dxa" w:w="1440"/>
-            <w:shd w:fill="F8FAFC"/>
-            <w:tcMar>
-              <w:top w:w="70" w:type="dxa"/>
-              <w:bottom w:w="70" w:type="dxa"/>
-              <w:left w:w="70" w:type="dxa"/>
-              <w:right w:w="70" w:type="dxa"/>
-            </w:tcMar>
-          </w:tcPr>
-          <w:p>
-            <w:pPr>
-              <w:jc w:val="center"/>
-            </w:pPr>
-            <w:r>
-              <w:rPr>
-                <w:rFonts w:ascii="Calibri" w:hAnsi="Calibri"/>
-                <w:b/>
-                <w:color w:val="0284C7"/>
-                <w:sz w:val="16"/>
-              </w:rPr>
-              <w:t>خياري</w:t>
-            </w:r>
-          </w:p>
-        </w:tc>
-        <w:tc>
-          <w:tcPr>
-            <w:tcW w:type="dxa" w:w="1440"/>
-            <w:shd w:fill="F8FAFC"/>
-            <w:tcMar>
-              <w:top w:w="70" w:type="dxa"/>
-              <w:bottom w:w="70" w:type="dxa"/>
-              <w:left w:w="70" w:type="dxa"/>
-              <w:right w:w="70" w:type="dxa"/>
-            </w:tcMar>
-          </w:tcPr>
-          <w:p>
-            <w:pPr>
-              <w:jc w:val="center"/>
-            </w:pPr>
-            <w:r>
-              <w:rPr>
-                <w:rFonts w:ascii="Calibri" w:hAnsi="Calibri"/>
-                <w:color w:val="DC2626"/>
-                <w:sz w:val="16"/>
-              </w:rPr>
-              <w:t>غير متوفر</w:t>
-            </w:r>
-          </w:p>
-        </w:tc>
-        <w:tc>
-          <w:tcPr>
-            <w:tcW w:type="dxa" w:w="1440"/>
-            <w:shd w:fill="F8FAFC"/>
-            <w:tcMar>
-              <w:top w:w="70" w:type="dxa"/>
-              <w:bottom w:w="70" w:type="dxa"/>
-              <w:left w:w="70" w:type="dxa"/>
-              <w:right w:w="70" w:type="dxa"/>
-            </w:tcMar>
-          </w:tcPr>
-          <w:p>
-            <w:pPr>
-              <w:jc w:val="center"/>
-            </w:pPr>
-            <w:r>
-              <w:rPr>
-                <w:rFonts w:ascii="Calibri" w:hAnsi="Calibri"/>
-                <w:color w:val="DC2626"/>
-                <w:sz w:val="16"/>
-              </w:rPr>
-              <w:t>غير متوفر</w:t>
-            </w:r>
-          </w:p>
-        </w:tc>
-        <w:tc>
-          <w:tcPr>
-            <w:tcW w:type="dxa" w:w="1440"/>
-            <w:shd w:fill="F8FAFC"/>
-            <w:tcMar>
-              <w:top w:w="70" w:type="dxa"/>
-              <w:bottom w:w="70" w:type="dxa"/>
-              <w:left w:w="70" w:type="dxa"/>
-              <w:right w:w="70" w:type="dxa"/>
-            </w:tcMar>
-          </w:tcPr>
-          <w:p>
-            <w:pPr>
-              <w:jc w:val="center"/>
-            </w:pPr>
-            <w:r>
-              <w:rPr>
-                <w:rFonts w:ascii="Calibri" w:hAnsi="Calibri"/>
-                <w:color w:val="1E293B"/>
-                <w:sz w:val="16"/>
-              </w:rPr>
-              <w:t>نعم (0-255 سم)</w:t>
-            </w:r>
-          </w:p>
-        </w:tc>
-        <w:tc>
-          <w:tcPr>
-            <w:tcW w:type="dxa" w:w="1440"/>
-            <w:shd w:fill="F8FAFC"/>
-            <w:tcMar>
-              <w:top w:w="70" w:type="dxa"/>
-              <w:bottom w:w="70" w:type="dxa"/>
-              <w:left w:w="70" w:type="dxa"/>
-              <w:right w:w="70" w:type="dxa"/>
-            </w:tcMar>
-          </w:tcPr>
-          <w:p>
-            <w:pPr>
-              <w:jc w:val="center"/>
-            </w:pPr>
-            <w:r>
-              <w:rPr>
-                <w:rFonts w:ascii="Calibri" w:hAnsi="Calibri"/>
-                <w:color w:val="1E293B"/>
-                <w:sz w:val="16"/>
-              </w:rPr>
-              <w:t>نعم (0-255 سم)</w:t>
-            </w:r>
-          </w:p>
-        </w:tc>
-      </w:tr>
-      <w:tr>
-        <w:tc>
-          <w:tcPr>
-            <w:tcW w:type="dxa" w:w="2880"/>
-            <w:shd w:fill="FFFFFF"/>
-            <w:tcMar>
-              <w:top w:w="70" w:type="dxa"/>
-              <w:bottom w:w="70" w:type="dxa"/>
-              <w:left w:w="70" w:type="dxa"/>
-              <w:right w:w="70" w:type="dxa"/>
-            </w:tcMar>
-          </w:tcPr>
-          <w:p>
-            <w:pPr>
-              <w:jc w:val="left"/>
-            </w:pPr>
-            <w:r>
-              <w:rPr>
-                <w:rFonts w:ascii="Calibri" w:hAnsi="Calibri"/>
-                <w:color w:val="1E293B"/>
-                <w:sz w:val="16"/>
-              </w:rPr>
-              <w:t>المؤشرات الحيوية (HI, WC, ET, Aridity)</w:t>
-            </w:r>
-          </w:p>
-        </w:tc>
-        <w:tc>
-          <w:tcPr>
-            <w:tcW w:type="dxa" w:w="1440"/>
-            <w:shd w:fill="FFFFFF"/>
-            <w:tcMar>
-              <w:top w:w="70" w:type="dxa"/>
-              <w:bottom w:w="70" w:type="dxa"/>
-              <w:left w:w="70" w:type="dxa"/>
-              <w:right w:w="70" w:type="dxa"/>
-            </w:tcMar>
-          </w:tcPr>
-          <w:p>
-            <w:pPr>
-              <w:jc w:val="center"/>
-            </w:pPr>
-            <w:r>
-              <w:rPr>
-                <w:rFonts w:ascii="Calibri" w:hAnsi="Calibri"/>
-                <w:b/>
-                <w:color w:val="0284C7"/>
-                <w:sz w:val="16"/>
-              </w:rPr>
-              <w:t>نعم (حساب 100%)</w:t>
-            </w:r>
-          </w:p>
-        </w:tc>
-        <w:tc>
-          <w:tcPr>
-            <w:tcW w:type="dxa" w:w="1440"/>
-            <w:shd w:fill="FFFFFF"/>
-            <w:tcMar>
-              <w:top w:w="70" w:type="dxa"/>
-              <w:bottom w:w="70" w:type="dxa"/>
-              <w:left w:w="70" w:type="dxa"/>
-              <w:right w:w="70" w:type="dxa"/>
-            </w:tcMar>
-          </w:tcPr>
-          <w:p>
-            <w:pPr>
-              <w:jc w:val="center"/>
-            </w:pPr>
-            <w:r>
-              <w:rPr>
-                <w:rFonts w:ascii="Calibri" w:hAnsi="Calibri"/>
-                <w:color w:val="1E293B"/>
-                <w:sz w:val="16"/>
-              </w:rPr>
-              <w:t>نعم (حساب رياضي)</w:t>
-            </w:r>
-          </w:p>
-        </w:tc>
-        <w:tc>
-          <w:tcPr>
-            <w:tcW w:type="dxa" w:w="1440"/>
-            <w:shd w:fill="FFFFFF"/>
-            <w:tcMar>
-              <w:top w:w="70" w:type="dxa"/>
-              <w:bottom w:w="70" w:type="dxa"/>
-              <w:left w:w="70" w:type="dxa"/>
-              <w:right w:w="70" w:type="dxa"/>
-            </w:tcMar>
-          </w:tcPr>
-          <w:p>
-            <w:pPr>
-              <w:jc w:val="center"/>
-            </w:pPr>
-            <w:r>
-              <w:rPr>
-                <w:rFonts w:ascii="Calibri" w:hAnsi="Calibri"/>
-                <w:color w:val="1E293B"/>
-                <w:sz w:val="16"/>
-              </w:rPr>
-              <w:t>نعم (حساب رياضي)</w:t>
-            </w:r>
-          </w:p>
-        </w:tc>
-        <w:tc>
-          <w:tcPr>
-            <w:tcW w:type="dxa" w:w="1440"/>
-            <w:shd w:fill="FFFFFF"/>
-            <w:tcMar>
-              <w:top w:w="70" w:type="dxa"/>
-              <w:bottom w:w="70" w:type="dxa"/>
-              <w:left w:w="70" w:type="dxa"/>
-              <w:right w:w="70" w:type="dxa"/>
-            </w:tcMar>
-          </w:tcPr>
-          <w:p>
-            <w:pPr>
-              <w:jc w:val="center"/>
-            </w:pPr>
-            <w:r>
-              <w:rPr>
-                <w:rFonts w:ascii="Calibri" w:hAnsi="Calibri"/>
-                <w:color w:val="1E293B"/>
-                <w:sz w:val="16"/>
-              </w:rPr>
-              <w:t>نعم (حساب رياضي)</w:t>
-            </w:r>
-          </w:p>
-        </w:tc>
-        <w:tc>
-          <w:tcPr>
-            <w:tcW w:type="dxa" w:w="1440"/>
-            <w:shd w:fill="FFFFFF"/>
-            <w:tcMar>
-              <w:top w:w="70" w:type="dxa"/>
-              <w:bottom w:w="70" w:type="dxa"/>
-              <w:left w:w="70" w:type="dxa"/>
-              <w:right w:w="70" w:type="dxa"/>
-            </w:tcMar>
-          </w:tcPr>
-          <w:p>
-            <w:pPr>
-              <w:jc w:val="center"/>
-            </w:pPr>
-            <w:r>
-              <w:rPr>
-                <w:rFonts w:ascii="Calibri" w:hAnsi="Calibri"/>
-                <w:color w:val="1E293B"/>
-                <w:sz w:val="16"/>
-              </w:rPr>
-              <w:t>نعم (حساب رياضي)</w:t>
-            </w:r>
-          </w:p>
-        </w:tc>
-      </w:tr>
-      <w:tr>
-        <w:tc>
-          <w:tcPr>
-            <w:tcW w:type="dxa" w:w="2880"/>
-            <w:shd w:fill="F8FAFC"/>
-            <w:tcMar>
-              <w:top w:w="70" w:type="dxa"/>
-              <w:bottom w:w="70" w:type="dxa"/>
-              <w:left w:w="70" w:type="dxa"/>
-              <w:right w:w="70" w:type="dxa"/>
-            </w:tcMar>
-          </w:tcPr>
-          <w:p>
-            <w:pPr>
-              <w:jc w:val="left"/>
-            </w:pPr>
-            <w:r>
-              <w:rPr>
-                <w:rFonts w:ascii="Calibri" w:hAnsi="Calibri"/>
-                <w:color w:val="1E293B"/>
-                <w:sz w:val="16"/>
-              </w:rPr>
-              <w:t>ضمان خلو الراستر من الخلايا الفارغة</w:t>
-            </w:r>
-          </w:p>
-        </w:tc>
-        <w:tc>
-          <w:tcPr>
-            <w:tcW w:type="dxa" w:w="1440"/>
-            <w:shd w:fill="F8FAFC"/>
-            <w:tcMar>
-              <w:top w:w="70" w:type="dxa"/>
-              <w:bottom w:w="70" w:type="dxa"/>
-              <w:left w:w="70" w:type="dxa"/>
-              <w:right w:w="70" w:type="dxa"/>
-            </w:tcMar>
-          </w:tcPr>
-          <w:p>
-            <w:pPr>
-              <w:jc w:val="center"/>
-            </w:pPr>
-            <w:r>
-              <w:rPr>
-                <w:rFonts w:ascii="Calibri" w:hAnsi="Calibri"/>
-                <w:b/>
-                <w:color w:val="0284C7"/>
-                <w:sz w:val="16"/>
-              </w:rPr>
-              <w:t>مضمون 100%</w:t>
-            </w:r>
-          </w:p>
-        </w:tc>
-        <w:tc>
-          <w:tcPr>
-            <w:tcW w:type="dxa" w:w="1440"/>
-            <w:shd w:fill="F8FAFC"/>
-            <w:tcMar>
-              <w:top w:w="70" w:type="dxa"/>
-              <w:bottom w:w="70" w:type="dxa"/>
-              <w:left w:w="70" w:type="dxa"/>
-              <w:right w:w="70" w:type="dxa"/>
-            </w:tcMar>
-          </w:tcPr>
-          <w:p>
-            <w:pPr>
-              <w:jc w:val="center"/>
-            </w:pPr>
-            <w:r>
-              <w:rPr>
-                <w:rFonts w:ascii="Calibri" w:hAnsi="Calibri"/>
-                <w:color w:val="1E293B"/>
-                <w:sz w:val="16"/>
-              </w:rPr>
-              <w:t>معرض للفجوات</w:t>
-            </w:r>
-          </w:p>
-        </w:tc>
-        <w:tc>
-          <w:tcPr>
-            <w:tcW w:type="dxa" w:w="1440"/>
-            <w:shd w:fill="F8FAFC"/>
-            <w:tcMar>
-              <w:top w:w="70" w:type="dxa"/>
-              <w:bottom w:w="70" w:type="dxa"/>
-              <w:left w:w="70" w:type="dxa"/>
-              <w:right w:w="70" w:type="dxa"/>
-            </w:tcMar>
-          </w:tcPr>
-          <w:p>
-            <w:pPr>
-              <w:jc w:val="center"/>
-            </w:pPr>
-            <w:r>
-              <w:rPr>
-                <w:rFonts w:ascii="Calibri" w:hAnsi="Calibri"/>
-                <w:color w:val="1E293B"/>
-                <w:sz w:val="16"/>
-              </w:rPr>
-              <w:t>مضمون 100%</w:t>
-            </w:r>
-          </w:p>
-        </w:tc>
-        <w:tc>
-          <w:tcPr>
-            <w:tcW w:type="dxa" w:w="1440"/>
-            <w:shd w:fill="F8FAFC"/>
-            <w:tcMar>
-              <w:top w:w="70" w:type="dxa"/>
-              <w:bottom w:w="70" w:type="dxa"/>
-              <w:left w:w="70" w:type="dxa"/>
-              <w:right w:w="70" w:type="dxa"/>
-            </w:tcMar>
-          </w:tcPr>
-          <w:p>
-            <w:pPr>
-              <w:jc w:val="center"/>
-            </w:pPr>
-            <w:r>
-              <w:rPr>
-                <w:rFonts w:ascii="Calibri" w:hAnsi="Calibri"/>
-                <w:color w:val="1E293B"/>
-                <w:sz w:val="16"/>
-              </w:rPr>
-              <w:t>مضمون 100%</w:t>
-            </w:r>
-          </w:p>
-        </w:tc>
-        <w:tc>
-          <w:tcPr>
-            <w:tcW w:type="dxa" w:w="1440"/>
-            <w:shd w:fill="F8FAFC"/>
-            <w:tcMar>
-              <w:top w:w="70" w:type="dxa"/>
-              <w:bottom w:w="70" w:type="dxa"/>
-              <w:left w:w="70" w:type="dxa"/>
-              <w:right w:w="70" w:type="dxa"/>
-            </w:tcMar>
-          </w:tcPr>
-          <w:p>
-            <w:pPr>
-              <w:jc w:val="center"/>
-            </w:pPr>
-            <w:r>
-              <w:rPr>
-                <w:rFonts w:ascii="Calibri" w:hAnsi="Calibri"/>
-                <w:color w:val="1E293B"/>
-                <w:sz w:val="16"/>
-              </w:rPr>
-              <w:t>مضمون 100%</w:t>
-            </w:r>
-          </w:p>
-        </w:tc>
-      </w:tr>
-    </w:tbl>
-    <w:p>
-      <w:pPr>
-        <w:spacing w:before="320" w:after="120"/>
-      </w:pPr>
-      <w:r>
-        <w:rPr>
-          <w:rFonts w:ascii="Arial" w:hAnsi="Arial"/>
-          <w:b/>
-          <w:color w:val="0284C7"/>
-          <w:sz w:val="26"/>
-        </w:rPr>
-        <w:t>3. مصفوفة ما يوفره وما يعجز عن توفيره كل مصدر / Capabilities vs Limitations</w:t>
-      </w:r>
-    </w:p>
-    <w:tbl>
-      <w:tblPr>
-        <w:tblW w:type="auto" w:w="0"/>
-        <w:jc w:val="center"/>
-        <w:tblLayout w:type="fixed"/>
-        <w:tblLook w:firstColumn="1" w:firstRow="1" w:lastColumn="0" w:lastRow="0" w:noHBand="0" w:noVBand="1" w:val="04A0"/>
-      </w:tblPr>
-      <w:tblGrid>
-        <w:gridCol w:w="3360"/>
-        <w:gridCol w:w="3360"/>
-        <w:gridCol w:w="3360"/>
-      </w:tblGrid>
-      <w:tr>
-        <w:tc>
-          <w:tcPr>
-            <w:tcW w:type="dxa" w:w="2592"/>
-            <w:shd w:fill="0F172A"/>
-            <w:tcMar>
-              <w:top w:w="100" w:type="dxa"/>
-              <w:bottom w:w="100" w:type="dxa"/>
-              <w:left w:w="90" w:type="dxa"/>
-              <w:right w:w="90" w:type="dxa"/>
-            </w:tcMar>
-          </w:tcPr>
-          <w:p>
-            <w:pPr>
-              <w:jc w:val="center"/>
-            </w:pPr>
-            <w:r>
-              <w:rPr>
-                <w:rFonts w:ascii="Arial" w:hAnsi="Arial"/>
-                <w:b/>
-                <w:color w:val="FFFFFF"/>
-                <w:sz w:val="17"/>
-              </w:rPr>
-              <w:t>مصدر البيانات / Source</w:t>
-            </w:r>
-          </w:p>
-        </w:tc>
-        <w:tc>
-          <w:tcPr>
-            <w:tcW w:type="dxa" w:w="4032"/>
-            <w:shd w:fill="0F172A"/>
-            <w:tcMar>
-              <w:top w:w="100" w:type="dxa"/>
-              <w:bottom w:w="100" w:type="dxa"/>
-              <w:left w:w="90" w:type="dxa"/>
-              <w:right w:w="90" w:type="dxa"/>
-            </w:tcMar>
-          </w:tcPr>
-          <w:p>
-            <w:pPr>
-              <w:jc w:val="center"/>
-            </w:pPr>
-            <w:r>
-              <w:rPr>
-                <w:rFonts w:ascii="Arial" w:hAnsi="Arial"/>
-                <w:b/>
-                <w:color w:val="FFFFFF"/>
-                <w:sz w:val="17"/>
-              </w:rPr>
-              <w:t>ما يستطيع المصدر توفيره بدقة (Capabilities)</w:t>
-            </w:r>
-          </w:p>
-        </w:tc>
-        <w:tc>
-          <w:tcPr>
-            <w:tcW w:type="dxa" w:w="4032"/>
-            <w:shd w:fill="0F172A"/>
-            <w:tcMar>
-              <w:top w:w="100" w:type="dxa"/>
-              <w:bottom w:w="100" w:type="dxa"/>
-              <w:left w:w="90" w:type="dxa"/>
-              <w:right w:w="90" w:type="dxa"/>
-            </w:tcMar>
-          </w:tcPr>
-          <w:p>
-            <w:pPr>
-              <w:jc w:val="center"/>
-            </w:pPr>
-            <w:r>
-              <w:rPr>
-                <w:rFonts w:ascii="Arial" w:hAnsi="Arial"/>
-                <w:b/>
-                <w:color w:val="FFFFFF"/>
-                <w:sz w:val="17"/>
-              </w:rPr>
-              <w:t>ما لا يستطيع المصدر توفيره والقيود (Limitations)</w:t>
-            </w:r>
-          </w:p>
-        </w:tc>
-      </w:tr>
-      <w:tr>
-        <w:tc>
-          <w:tcPr>
-            <w:tcW w:type="dxa" w:w="2592"/>
-            <w:shd w:fill="FFFFFF"/>
-            <w:tcMar>
-              <w:top w:w="80" w:type="dxa"/>
-              <w:bottom w:w="80" w:type="dxa"/>
-              <w:left w:w="90" w:type="dxa"/>
-              <w:right w:w="90" w:type="dxa"/>
-            </w:tcMar>
-          </w:tcPr>
-          <w:p>
-            <w:pPr>
-              <w:jc w:val="center"/>
-            </w:pPr>
-            <w:r>
-              <w:rPr>
-                <w:rFonts w:ascii="Calibri" w:hAnsi="Calibri"/>
-                <w:b/>
-                <w:color w:val="0284C7"/>
-                <w:sz w:val="17"/>
-              </w:rPr>
-              <w:t>Hybrid Climate Engine</w:t>
-              <w:br/>
-              <w:t>(الافتراضي للأداة)</w:t>
-            </w:r>
-          </w:p>
-        </w:tc>
-        <w:tc>
-          <w:tcPr>
-            <w:tcW w:type="dxa" w:w="4032"/>
-            <w:shd w:fill="FFFFFF"/>
-            <w:tcMar>
-              <w:top w:w="80" w:type="dxa"/>
-              <w:bottom w:w="80" w:type="dxa"/>
-              <w:left w:w="90" w:type="dxa"/>
-              <w:right w:w="90" w:type="dxa"/>
-            </w:tcMar>
-          </w:tcPr>
-          <w:p>
-            <w:pPr>
-              <w:jc w:val="left"/>
-            </w:pPr>
-            <w:r>
-              <w:rPr>
-                <w:rFonts w:ascii="Calibri" w:hAnsi="Calibri"/>
-                <w:color w:val="1E293B"/>
-                <w:sz w:val="17"/>
-              </w:rPr>
-              <w:t>• تغطية 100% لجميع الموديلات الـ 19 دون أي قيم مفقودة.</w:t>
-              <w:br/>
-              <w:t>• رصد مادي حقيقي لأجهزة المحطة (حرارة، رطوبة، ضغط، رياح، أمطار).</w:t>
-              <w:br/>
-              <w:t>• دمج الإشعاع الشمسي والـ UV وحرارة السطح من الأقمار الصناعية (CERES).</w:t>
-              <w:br/>
-              <w:t>• حساب رياضي كامل لجميع النماذج البيومناخية الـ 8.</w:t>
-              <w:br/>
-              <w:t>• ضمان خلو أسطح الراستر النهائية من أي بكسلات فارغة.</w:t>
-            </w:r>
-          </w:p>
-        </w:tc>
-        <w:tc>
-          <w:tcPr>
-            <w:tcW w:type="dxa" w:w="4032"/>
-            <w:shd w:fill="FFFFFF"/>
-            <w:tcMar>
-              <w:top w:w="80" w:type="dxa"/>
-              <w:bottom w:w="80" w:type="dxa"/>
-              <w:left w:w="90" w:type="dxa"/>
-              <w:right w:w="90" w:type="dxa"/>
-            </w:tcMar>
-          </w:tcPr>
-          <w:p>
-            <w:pPr>
-              <w:jc w:val="left"/>
-            </w:pPr>
-            <w:r>
-              <w:rPr>
-                <w:rFonts w:ascii="Calibri" w:hAnsi="Calibri"/>
-                <w:color w:val="1E293B"/>
-                <w:sz w:val="17"/>
-              </w:rPr>
-              <w:t>• لا يوفر قراءات بيرانوميتر أرضية (يعتمد على الأقمار الصناعية).</w:t>
-              <w:br/>
-              <w:t>• لا يوفر مقاطع رطوبة وحرارة التربة بالأعماق لجميع المحطات.</w:t>
-              <w:br/>
-              <w:t>• لا يصلح كبديل للتقارير الجنائية القضائية المشترطة للسجلات الخام دون استكمال.</w:t>
-              <w:br/>
-              <w:t>• لا يمكنه استكمال ثغرات المحطات المتوقفة قبل عام 1940.</w:t>
-            </w:r>
-          </w:p>
-        </w:tc>
-      </w:tr>
-      <w:tr>
-        <w:tc>
-          <w:tcPr>
-            <w:tcW w:type="dxa" w:w="2592"/>
-            <w:shd w:fill="F8FAFC"/>
-            <w:tcMar>
-              <w:top w:w="80" w:type="dxa"/>
-              <w:bottom w:w="80" w:type="dxa"/>
-              <w:left w:w="90" w:type="dxa"/>
-              <w:right w:w="90" w:type="dxa"/>
-            </w:tcMar>
-          </w:tcPr>
-          <w:p>
-            <w:pPr>
-              <w:jc w:val="center"/>
-            </w:pPr>
-            <w:r>
-              <w:rPr>
-                <w:rFonts w:ascii="Calibri" w:hAnsi="Calibri"/>
-                <w:b/>
-                <w:color w:val="0284C7"/>
-                <w:sz w:val="17"/>
-              </w:rPr>
-              <w:t>NOAA ISD / GHCN Archive</w:t>
-              <w:br/>
-              <w:t>(الرصد الأرضي المباشر)</w:t>
-            </w:r>
-          </w:p>
-        </w:tc>
-        <w:tc>
-          <w:tcPr>
-            <w:tcW w:type="dxa" w:w="4032"/>
-            <w:shd w:fill="F8FAFC"/>
-            <w:tcMar>
-              <w:top w:w="80" w:type="dxa"/>
-              <w:bottom w:w="80" w:type="dxa"/>
-              <w:left w:w="90" w:type="dxa"/>
-              <w:right w:w="90" w:type="dxa"/>
-            </w:tcMar>
-          </w:tcPr>
-          <w:p>
-            <w:pPr>
-              <w:jc w:val="left"/>
-            </w:pPr>
-            <w:r>
-              <w:rPr>
-                <w:rFonts w:ascii="Calibri" w:hAnsi="Calibri"/>
-                <w:color w:val="1E293B"/>
-                <w:sz w:val="17"/>
-              </w:rPr>
-              <w:t>• حقيقة أرضية مادية 100% من أجهزة ومستشعرات المحطة دون أي نمذجة.</w:t>
-              <w:br/>
-              <w:t>• حرارة الهواء، ونقطة الندى، والرطوبة النسبية السيكرومترية.</w:t>
-              <w:br/>
-              <w:t>• ضغط سطح المحطة وضغط مستوى البحر (PSL) والآيزوبار.</w:t>
-              <w:br/>
-              <w:t>• سرعة واتجاه الرياح وعواصف الرياح القصوى (Wind Gusts).</w:t>
-              <w:br/>
-              <w:t>• كميات الأمطار اليومية والساعية وشفرات الطقس الحاضر.</w:t>
-              <w:br/>
-              <w:t>• حجية قانونية رسمية وموثوقية معتمدة للتقارير القضائية.</w:t>
-            </w:r>
-          </w:p>
-        </w:tc>
-        <w:tc>
-          <w:tcPr>
-            <w:tcW w:type="dxa" w:w="4032"/>
-            <w:shd w:fill="F8FAFC"/>
-            <w:tcMar>
-              <w:top w:w="80" w:type="dxa"/>
-              <w:bottom w:w="80" w:type="dxa"/>
-              <w:left w:w="90" w:type="dxa"/>
-              <w:right w:w="90" w:type="dxa"/>
-            </w:tcMar>
-          </w:tcPr>
-          <w:p>
-            <w:pPr>
-              <w:jc w:val="left"/>
-            </w:pPr>
-            <w:r>
-              <w:rPr>
-                <w:rFonts w:ascii="Calibri" w:hAnsi="Calibri"/>
-                <w:color w:val="1E293B"/>
-                <w:sz w:val="17"/>
-              </w:rPr>
-              <w:t>• لا يوفر الإشعاع الشمسي (Solar Radiation) لمعظم المحطات.</w:t>
-              <w:br/>
-              <w:t>• لا يوفر مؤشر الأشعة فوق البنفسجية (UV Index).</w:t>
-              <w:br/>
-              <w:t>• لا يوفر حرارة سطح الأرض الإشعاعية (LST).</w:t>
-              <w:br/>
-              <w:t>• لا يوفر مقاطع رطوبة وحرارة التربة بالأعماق.</w:t>
-              <w:br/>
-              <w:t>• معرض لوجود قيم مفقودة وفترات انقطاع بسبب صيانة الحساسات.</w:t>
-              <w:br/>
-              <w:t>• لا يوفر تغطية شبكية في المناطق الخالية من أبراج المحطات.</w:t>
-            </w:r>
-          </w:p>
-        </w:tc>
-      </w:tr>
-      <w:tr>
-        <w:tc>
-          <w:tcPr>
-            <w:tcW w:type="dxa" w:w="2592"/>
-            <w:shd w:fill="FFFFFF"/>
-            <w:tcMar>
-              <w:top w:w="80" w:type="dxa"/>
-              <w:bottom w:w="80" w:type="dxa"/>
-              <w:left w:w="90" w:type="dxa"/>
-              <w:right w:w="90" w:type="dxa"/>
-            </w:tcMar>
-          </w:tcPr>
-          <w:p>
-            <w:pPr>
-              <w:jc w:val="center"/>
-            </w:pPr>
-            <w:r>
-              <w:rPr>
-                <w:rFonts w:ascii="Calibri" w:hAnsi="Calibri"/>
-                <w:b/>
-                <w:color w:val="0284C7"/>
-                <w:sz w:val="17"/>
-              </w:rPr>
-              <w:t>NASA POWER Agroclimatology</w:t>
-              <w:br/>
-              <w:t>(المناخ الزراعي والشمسي)</w:t>
-            </w:r>
-          </w:p>
-        </w:tc>
-        <w:tc>
-          <w:tcPr>
-            <w:tcW w:type="dxa" w:w="4032"/>
-            <w:shd w:fill="FFFFFF"/>
-            <w:tcMar>
-              <w:top w:w="80" w:type="dxa"/>
-              <w:bottom w:w="80" w:type="dxa"/>
-              <w:left w:w="90" w:type="dxa"/>
-              <w:right w:w="90" w:type="dxa"/>
-            </w:tcMar>
-          </w:tcPr>
-          <w:p>
-            <w:pPr>
-              <w:jc w:val="left"/>
-            </w:pPr>
-            <w:r>
-              <w:rPr>
-                <w:rFonts w:ascii="Calibri" w:hAnsi="Calibri"/>
-                <w:color w:val="1E293B"/>
-                <w:sz w:val="17"/>
-              </w:rPr>
-              <w:t>• المعيار العالمي الذهبي للإشعاع الشمسي السطحي (أقمار CERES).</w:t>
-              <w:br/>
-              <w:t>• مؤشر الأشعة فوق البنفسجية اليومي (UV Index) الفضائي.</w:t>
-              <w:br/>
-              <w:t>• تغطية شبكية عالمية متصلة 100% بدون أي فجوات مكانية.</w:t>
-              <w:br/>
-              <w:t>• درجات حرارة الهواء على ارتفاع 2م وحرارة جلد الأرض (LST).</w:t>
-              <w:br/>
-              <w:t>• سرعة الرياح على ارتفاعات 2م و 10م و 50م واتجاه الرياح.</w:t>
-              <w:br/>
-              <w:t>• معدل الأمطار اليومي المصحح ونسبة الغطاء السحابي الكلي.</w:t>
-            </w:r>
-          </w:p>
-        </w:tc>
-        <w:tc>
-          <w:tcPr>
-            <w:tcW w:type="dxa" w:w="4032"/>
-            <w:shd w:fill="FFFFFF"/>
-            <w:tcMar>
-              <w:top w:w="80" w:type="dxa"/>
-              <w:bottom w:w="80" w:type="dxa"/>
-              <w:left w:w="90" w:type="dxa"/>
-              <w:right w:w="90" w:type="dxa"/>
-            </w:tcMar>
-          </w:tcPr>
-          <w:p>
-            <w:pPr>
-              <w:jc w:val="left"/>
-            </w:pPr>
-            <w:r>
-              <w:rPr>
-                <w:rFonts w:ascii="Calibri" w:hAnsi="Calibri"/>
-                <w:color w:val="1E293B"/>
-                <w:sz w:val="17"/>
-              </w:rPr>
-              <w:t>• لا يوفر بيانات تاريخية قبل 1 يناير 1981 (1901-1980 غير متوفر).</w:t>
-              <w:br/>
-              <w:t>• لا يوفر هبات الرياح اللحظية القصوى (Wind Gusts).</w:t>
-              <w:br/>
-              <w:t>• لا يوفر ضغط مستوى سطح البحر (PSL) مباشرة (يوفر الضغط السطحي PS).</w:t>
-              <w:br/>
-              <w:t>• لا يوفر رطوبة أو حرارة التربة بالأعماق (0-255 سم).</w:t>
-              <w:br/>
-              <w:t>• دقة الخلية واسعة (~50 × 60 كم) لا تلتقط تضاريس الأودية الجبلية الضيقة.</w:t>
-              <w:br/>
-              <w:t>• يتأخر من 2 إلى 4 أيام عن التاريخ الحالي (ليس لحظياً).</w:t>
-            </w:r>
-          </w:p>
-        </w:tc>
-      </w:tr>
-      <w:tr>
-        <w:tc>
-          <w:tcPr>
-            <w:tcW w:type="dxa" w:w="2592"/>
-            <w:shd w:fill="F8FAFC"/>
-            <w:tcMar>
-              <w:top w:w="80" w:type="dxa"/>
-              <w:bottom w:w="80" w:type="dxa"/>
-              <w:left w:w="90" w:type="dxa"/>
-              <w:right w:w="90" w:type="dxa"/>
-            </w:tcMar>
-          </w:tcPr>
-          <w:p>
-            <w:pPr>
-              <w:jc w:val="center"/>
-            </w:pPr>
-            <w:r>
-              <w:rPr>
-                <w:rFonts w:ascii="Calibri" w:hAnsi="Calibri"/>
-                <w:b/>
-                <w:color w:val="0284C7"/>
-                <w:sz w:val="17"/>
-              </w:rPr>
-              <w:t>Open-Meteo ERA5 / ERA5-Land</w:t>
-              <w:br/>
-              <w:t>(إعادة التحليل فائقة الدقة)</w:t>
-            </w:r>
-          </w:p>
-        </w:tc>
-        <w:tc>
-          <w:tcPr>
-            <w:tcW w:type="dxa" w:w="4032"/>
-            <w:shd w:fill="F8FAFC"/>
-            <w:tcMar>
-              <w:top w:w="80" w:type="dxa"/>
-              <w:bottom w:w="80" w:type="dxa"/>
-              <w:left w:w="90" w:type="dxa"/>
-              <w:right w:w="90" w:type="dxa"/>
-            </w:tcMar>
-          </w:tcPr>
-          <w:p>
-            <w:pPr>
-              <w:jc w:val="left"/>
-            </w:pPr>
-            <w:r>
-              <w:rPr>
-                <w:rFonts w:ascii="Calibri" w:hAnsi="Calibri"/>
-                <w:color w:val="1E293B"/>
-                <w:sz w:val="17"/>
-              </w:rPr>
-              <w:t>• أعلى دقة مكانية عالمية في نماذج إعادة التحليل لليابسة: 0.10° (~9 كم).</w:t>
-              <w:br/>
-              <w:t>• سلسلة زمنية تاريخية مستمرة لأكثر من 85 عاماً (1940 إلى الآن).</w:t>
-              <w:br/>
-              <w:t>• مراعاة انحدار درجات الحرارة مع الارتفاع والتضاريس (DEM).</w:t>
-              <w:br/>
-              <w:t>• درجات حرارة الهواء، والحرارة المحسوسة، وهبات الرياح (Gusts).</w:t>
-              <w:br/>
-              <w:t>• ضغط مستوى سطح البحر المباشر عالي الدقة (PSL).</w:t>
-              <w:br/>
-              <w:t>• رطوبة وحرارة التربة عند 4 أعماق متتالية (0-255 سم).</w:t>
-              <w:br/>
-              <w:t>• البخر-نتح المرجعي القياسي ET0 بمعادلة فاو-56 بنمان مونتيث.</w:t>
-            </w:r>
-          </w:p>
-        </w:tc>
-        <w:tc>
-          <w:tcPr>
-            <w:tcW w:type="dxa" w:w="4032"/>
-            <w:shd w:fill="F8FAFC"/>
-            <w:tcMar>
-              <w:top w:w="80" w:type="dxa"/>
-              <w:bottom w:w="80" w:type="dxa"/>
-              <w:left w:w="90" w:type="dxa"/>
-              <w:right w:w="90" w:type="dxa"/>
-            </w:tcMar>
-          </w:tcPr>
-          <w:p>
-            <w:pPr>
-              <w:jc w:val="left"/>
-            </w:pPr>
-            <w:r>
-              <w:rPr>
-                <w:rFonts w:ascii="Calibri" w:hAnsi="Calibri"/>
-                <w:color w:val="1E293B"/>
-                <w:sz w:val="17"/>
-              </w:rPr>
-              <w:t>• لا يوفر بيانات تاريخية قبل عام 1940 (1901-1939 غير متوفر).</w:t>
-              <w:br/>
-              <w:t>• لا يوفر مؤشر UV الفضائي المباشر (يقدم تقديرات إشعاعية عامة).</w:t>
-              <w:br/>
-              <w:t>• ليس رصداً مادياً حقيقياً لأجهزة المحطة (هو نموذج رياضي استيعابي).</w:t>
-              <w:br/>
-              <w:t>• يتأخر من 2 إلى 5 أيام عن التاريخ الحالي لإجراء المراجعات والتدقيق.</w:t>
-            </w:r>
-          </w:p>
-        </w:tc>
-      </w:tr>
-      <w:tr>
-        <w:tc>
-          <w:tcPr>
-            <w:tcW w:type="dxa" w:w="2592"/>
-            <w:shd w:fill="FFFFFF"/>
-            <w:tcMar>
-              <w:top w:w="80" w:type="dxa"/>
-              <w:bottom w:w="80" w:type="dxa"/>
-              <w:left w:w="90" w:type="dxa"/>
-              <w:right w:w="90" w:type="dxa"/>
-            </w:tcMar>
-          </w:tcPr>
-          <w:p>
-            <w:pPr>
-              <w:jc w:val="center"/>
-            </w:pPr>
-            <w:r>
-              <w:rPr>
-                <w:rFonts w:ascii="Calibri" w:hAnsi="Calibri"/>
-                <w:b/>
-                <w:color w:val="0284C7"/>
-                <w:sz w:val="17"/>
-              </w:rPr>
-              <w:t>Copernicus Climate Data Store</w:t>
-              <w:br/>
-              <w:t>(CDS / ERA5 / AgERA5)</w:t>
-            </w:r>
-          </w:p>
-        </w:tc>
-        <w:tc>
-          <w:tcPr>
-            <w:tcW w:type="dxa" w:w="4032"/>
-            <w:shd w:fill="FFFFFF"/>
-            <w:tcMar>
-              <w:top w:w="80" w:type="dxa"/>
-              <w:bottom w:w="80" w:type="dxa"/>
-              <w:left w:w="90" w:type="dxa"/>
-              <w:right w:w="90" w:type="dxa"/>
-            </w:tcMar>
-          </w:tcPr>
-          <w:p>
-            <w:pPr>
-              <w:jc w:val="left"/>
-            </w:pPr>
-            <w:r>
-              <w:rPr>
-                <w:rFonts w:ascii="Calibri" w:hAnsi="Calibri"/>
-                <w:color w:val="1E293B"/>
-                <w:sz w:val="17"/>
-              </w:rPr>
-              <w:t>• المصدر المرجعي الرسمي المعتمد من المفوضية الأوروبية ومركز ECMWF الدولي.</w:t>
-              <w:br/>
-              <w:t>• دقة مكانية فائقة 0.10° (~9 كم) عبر شبكة ERA5-Land لليابسة.</w:t>
-              <w:br/>
-              <w:t>• سلسلة زمنية تاريخية متواصلة من عام 1940 وحتى الوقت الحاضر.</w:t>
-              <w:br/>
-              <w:t>• دعم مفتاح الوصول الرسمي (CDS API Key) مع دعم التدفق السريع دون مفتاح (Zero-Auth Fallback).</w:t>
-              <w:br/>
-              <w:t>• توافق تام مع استخراج شرائح الراستر بصيغة NetCDF وتحويلها لنقاط جغرافية.</w:t>
-              <w:br/>
-              <w:t>• رطوبة وحرارة التربة عند 4 أعماق متتالية (0-255 سم).</w:t>
-            </w:r>
-          </w:p>
-        </w:tc>
-        <w:tc>
-          <w:tcPr>
-            <w:tcW w:type="dxa" w:w="4032"/>
-            <w:shd w:fill="FFFFFF"/>
-            <w:tcMar>
-              <w:top w:w="80" w:type="dxa"/>
-              <w:bottom w:w="80" w:type="dxa"/>
-              <w:left w:w="90" w:type="dxa"/>
-              <w:right w:w="90" w:type="dxa"/>
-            </w:tcMar>
-          </w:tcPr>
-          <w:p>
-            <w:pPr>
-              <w:jc w:val="left"/>
-            </w:pPr>
-            <w:r>
-              <w:rPr>
-                <w:rFonts w:ascii="Calibri" w:hAnsi="Calibri"/>
-                <w:color w:val="1E293B"/>
-                <w:sz w:val="17"/>
-              </w:rPr>
-              <w:t>• لا يوفر بيانات تاريخية قبل عام 1940 (1901-1939 غير متوفر).</w:t>
-              <w:br/>
-              <w:t>• الاستعلام المباشر عبر CDS API قد يتطلب الانتظار في طوابير معالجة (Queuing) إذا كانت خوادم CDS مزدحمة.</w:t>
-              <w:br/>
-              <w:t>• يتأخر من 2 إلى 5 أيام عن الوقت الفعلي لمطابقة الفحوصات الجوية.</w:t>
-              <w:br/>
-              <w:t>• ليس رصداً مادياً لمحطة أرضية حقيقية وإنما نموذج إعادة تحليل استيعابي.</w:t>
-            </w:r>
-          </w:p>
-        </w:tc>
-      </w:tr>
-    </w:tbl>
-    <w:p>
-      <w:pPr>
-        <w:spacing w:before="320" w:after="120"/>
-      </w:pPr>
-      <w:r>
-        <w:rPr>
-          <w:rFonts w:ascii="Arial" w:hAnsi="Arial"/>
-          <w:b/>
-          <w:color w:val="0284C7"/>
-          <w:sz w:val="26"/>
-        </w:rPr>
-        <w:t>4. قواعد وشجرة اتخاذ القرار للباحث الجغرافي / Decision Guide</w:t>
+        <w:t>Auto chooses the finest suitable product per variable inside the selected provider for the entire period. Open-Meteo uses ERA5-Land at 0.1 degree for supported temperature, humidity and dewpoint variables, and ERA5 at 0.25 degree for other supported variables. Intervals beginning before 1950 use ERA5 throughout. Advanced settings permit a fixed manual model. Fixed-grid products keep their native grids; smaller output pixels do not create source detail.</w:t>
       </w:r>
     </w:p>
     <w:p>
       <w:pPr>
-        <w:spacing w:after="80"/>
+        <w:jc w:val="start"/>
+        <w:bidi/>
       </w:pPr>
       <w:r>
         <w:rPr>
-          <w:rFonts w:ascii="Arial" w:hAnsi="Arial"/>
-          <w:b/>
-          <w:color w:val="0F172A"/>
-          <w:sz w:val="20"/>
+          <w:rtl/>
         </w:rPr>
-        <w:t xml:space="preserve">• لإنتاج أطلس مناخي متكامل وخالٍ من الخلايا المفقودة (الخيار الافتراضي): </w:t>
-      </w:r>
-      <w:r>
-        <w:rPr>
-          <w:rFonts w:ascii="Calibri" w:hAnsi="Calibri"/>
-          <w:color w:val="1E293B"/>
-          <w:sz w:val="20"/>
-        </w:rPr>
-        <w:t>اختر [Hybrid Engine] حيث يضمن لك الاستناد إلى الرصد الميداني الحقيقي للمحطة مع استكمال أي فجوات وصيانة تلقائياً.</w:t>
+        <w:t>يختار Auto أدق منتج مناسب لكل متغير داخل المصدر المختار وللفترة كاملة، مع اختيار يدوي متقدم عند الحاجة. شبكة المصدر الثابتة لا تتغير بتصغير خلية الراستر الناتج. يُسجل المنتج والدقة لكل متغير في بيانات المصدر الخام وورقة Source_Resolution في Desktop.</w:t>
       </w:r>
     </w:p>
     <w:p>
       <w:pPr>
-        <w:spacing w:after="80"/>
+        <w:pStyle w:val="Heading2"/>
       </w:pPr>
       <w:r>
-        <w:rPr>
-          <w:rFonts w:ascii="Arial" w:hAnsi="Arial"/>
-          <w:b/>
-          <w:color w:val="0F172A"/>
-          <w:sz w:val="20"/>
-        </w:rPr>
-        <w:t xml:space="preserve">• للتدقيق الأكاديمي والرصد الميداني البحت من موازين الحرارة والبارومترات: </w:t>
+        <w:t>Hybrid and missing data</w:t>
       </w:r>
+    </w:p>
+    <w:p>
       <w:r>
-        <w:rPr>
-          <w:rFonts w:ascii="Calibri" w:hAnsi="Calibri"/>
-          <w:color w:val="1E293B"/>
-          <w:sz w:val="20"/>
-        </w:rPr>
-        <w:t>اختر [NOAA ISD Ground] للاعتماد الحصري على المستشعرات المادية في المحطة دون أي نمذجة رياضية.</w:t>
+        <w:t>Station Hybrid finishes NOAA across the network, then ERA5 for missing values, then NASA POWER for remaining gaps, then optional monthly Gap Fill. Any-point Hybrid starts at ERA5. Raw observations and estimates remain separate. Missing precipitation is never zero; monthly/composite sources never fabricate daily observations. No source guarantees complete coverage.</w:t>
       </w:r>
     </w:p>
     <w:p>
       <w:pPr>
-        <w:spacing w:after="80"/>
+        <w:pStyle w:val="Heading2"/>
       </w:pPr>
       <w:r>
-        <w:rPr>
-          <w:rFonts w:ascii="Arial" w:hAnsi="Arial"/>
-          <w:b/>
-          <w:color w:val="0F172A"/>
-          <w:sz w:val="20"/>
-        </w:rPr>
-        <w:t xml:space="preserve">• لدراسات الطاقة الشمسية والحرارية واستهلاك المياه الزراعي بعد عام 1981: </w:t>
+        <w:t>Need Sign In</w:t>
       </w:r>
+    </w:p>
+    <w:p>
       <w:r>
-        <w:rPr>
-          <w:rFonts w:ascii="Calibri" w:hAnsi="Calibri"/>
-          <w:color w:val="1E293B"/>
-          <w:sz w:val="20"/>
-        </w:rPr>
-        <w:t>اختر [NASA POWER API] للاستفادة من المعيار الذهبي لأقمار CERES ودقة الطاقة الشمسية المتصلة.</w:t>
+        <w:t>CDS needs the user’s personal API token and accepted dataset terms. IMERG needs NASA Earthdata credentials and GES DISC authorization. Credentials stay in memory and pass to Desktop workers through a pipe, outside project/job/log files. These adapters pass protocol and conversion checks; live authenticated end-to-end verification remains pending.</w:t>
       </w:r>
     </w:p>
     <w:p>
       <w:pPr>
-        <w:spacing w:after="80"/>
+        <w:jc w:val="start"/>
+        <w:bidi/>
       </w:pPr>
       <w:r>
         <w:rPr>
-          <w:rFonts w:ascii="Arial" w:hAnsi="Arial"/>
-          <w:b/>
-          <w:color w:val="0F172A"/>
-          <w:sz w:val="20"/>
+          <w:rtl/>
         </w:rPr>
-        <w:t xml:space="preserve">• للمناطق الجبلية والتضاريس الوعرة، أو دراسات حرارة ورطوبة التربة، أو الفترات من 1940 إلى 1980: </w:t>
+        <w:t>يستخدم كل مستخدم حسابه الخاص؛ لا يحتاج البرنامج حساب المطور. تظل الأسرار خارج ملفات المشروع والسجلات. نهاية الأرشيف متغيرة، وتاريخ بداية المنتج لا يضمن وجود كل عنصر في كل موقع.</w:t>
       </w:r>
+    </w:p>
+    <w:p>
       <w:r>
-        <w:rPr>
-          <w:rFonts w:ascii="Calibri" w:hAnsi="Calibri"/>
-          <w:color w:val="1E293B"/>
-          <w:sz w:val="20"/>
-        </w:rPr>
-        <w:t>اختر [Open-Meteo ERA5] للاستفادة من أعلى دقة مكانية متاحة عالمياً (~9 كم) المعدلة طبوغرافياً.</w:t>
+        <w:br w:type="page"/>
       </w:r>
     </w:p>
     <w:p>
       <w:pPr>
-        <w:spacing w:after="80"/>
+        <w:pStyle w:val="Heading1"/>
+      </w:pPr>
+      <w:r>
+        <w:t>NASA POWER</w:t>
+      </w:r>
+    </w:p>
+    <w:p>
+      <w:r>
+        <w:t>Coverage  Meteorology 1981; radiation 1984; UV 2001 to Latest published data, variable-dependent</w:t>
+      </w:r>
+    </w:p>
+    <w:p>
+      <w:r>
+        <w:t>Native resolution  0.5 x 0.625 degree meteorology; 1 x 1 degree radiation/cloud  |  Daily points; monthly regional</w:t>
+      </w:r>
+    </w:p>
+    <w:p>
+      <w:r>
+        <w:t>Region and tools  Global  |  points, stations, regional</w:t>
+      </w:r>
+    </w:p>
+    <w:p>
+      <w:r>
+        <w:t>Variables  T2M, T2M_MAX, T2M_MIN, T2MDEW, TS, PRECTOTCORR, RH2M, CLOUD_AMT, PS, SLP, WS10M, WD10M, ALLSKY_SFC_SW_DWN, ALLSKY_SFC_UV_INDEX</w:t>
+      </w:r>
+    </w:p>
+    <w:p>
+      <w:r>
+        <w:t>Fixed variable-specific grids; smaller output pixels do not increase source information resolution.</w:t>
+      </w:r>
+    </w:p>
+    <w:p>
+      <w:pPr>
+        <w:jc w:val="start"/>
+        <w:bidi/>
       </w:pPr>
       <w:r>
         <w:rPr>
-          <w:rFonts w:ascii="Arial" w:hAnsi="Arial"/>
-          <w:b/>
-          <w:color w:val="0F172A"/>
-          <w:sz w:val="20"/>
+          <w:rtl/>
         </w:rPr>
-        <w:t xml:space="preserve">• للأبحاث الأوروبية المعتمدة رسمياً والوصول المباشر لبيانات ECMWF و ERA5-Land: </w:t>
+        <w:t>شبكات ثابتة حسب المتغير؛ تصغير بكسل الإخراج لا يزيد دقة معلومات المصدر.</w:t>
       </w:r>
+    </w:p>
+    <w:p>
+      <w:pPr>
+        <w:spacing w:after="320"/>
+      </w:pPr>
+      <w:r>
+        <w:t>Official reference  https://power.larc.nasa.gov/docs/</w:t>
+      </w:r>
+    </w:p>
+    <w:p>
+      <w:pPr>
+        <w:pStyle w:val="Heading1"/>
+      </w:pPr>
+      <w:r>
+        <w:t>Open-Meteo ERA5 / ERA5-Land</w:t>
+      </w:r>
+    </w:p>
+    <w:p>
+      <w:r>
+        <w:t>Coverage  ERA5 1940; Land 1950 to Latest archive, typically delayed</w:t>
+      </w:r>
+    </w:p>
+    <w:p>
+      <w:r>
+        <w:t>Native resolution  Auto: Land 0.1 degree or ERA5 0.25 degree per variable and full interval  |  Daily</w:t>
+      </w:r>
+    </w:p>
+    <w:p>
+      <w:r>
+        <w:t>Region and tools  Global; Land variables require valid land cells  |  points, stations</w:t>
+      </w:r>
+    </w:p>
+    <w:p>
+      <w:r>
+        <w:t>Variables  T2M, T2M_MAX, T2M_MIN, PRECTOTCORR, ALLSKY_SFC_SW_DWN, RH2M, T2MDEW, PS, SLP, WS10M, WD10M, CLOUD_AMT</w:t>
+      </w:r>
+    </w:p>
+    <w:p>
+      <w:r>
+        <w:t>Auto uses Land for temperature, RH and dewpoint and ERA5 for other supported variables. An interval beginning before 1950 uses ERA5 throughout. Standalone never supplements NASA; legacy and Hybrid retain explicitly separate policies.</w:t>
+      </w:r>
+    </w:p>
+    <w:p>
+      <w:pPr>
+        <w:jc w:val="start"/>
+        <w:bidi/>
+      </w:pPr>
       <w:r>
         <w:rPr>
-          <w:rFonts w:ascii="Calibri" w:hAnsi="Calibri"/>
-          <w:color w:val="1E293B"/>
-          <w:sz w:val="20"/>
+          <w:rtl/>
         </w:rPr>
-        <w:t>اختر [Copernicus Climate Data Store (CDS)] للاستفادة من المرجعية الأوروبية الرسمية لبرنامج كوبرنيكوس مع إمكانية إدخال CDS API Key الخاص بك أو العمل المباشر دون تسجيل.</w:t>
+        <w:t>Auto يستخدم Land للحرارة والرطوبة والندى، وERA5 لبقية المتغيرات المدعومة. للفترة التي تبدأ قبل 1950 يستخدم ERA5 كاملًا. الوضع المستقل لا يستكمل NASA؛ المسار القديم والهجين لهما سياسة معلنة منفصلة.</w:t>
+      </w:r>
+    </w:p>
+    <w:p>
+      <w:pPr>
+        <w:spacing w:after="320"/>
+      </w:pPr>
+      <w:r>
+        <w:t>Official reference  https://open-meteo.com/en/docs/historical-weather-api</w:t>
+      </w:r>
+    </w:p>
+    <w:p>
+      <w:r>
+        <w:br w:type="page"/>
+      </w:r>
+    </w:p>
+    <w:p>
+      <w:pPr>
+        <w:pStyle w:val="Heading1"/>
+      </w:pPr>
+      <w:r>
+        <w:t>NOAA GSOD</w:t>
+      </w:r>
+    </w:p>
+    <w:p>
+      <w:r>
+        <w:t>Coverage  General archive 1929; station/element-specific to Station/year-specific</w:t>
+      </w:r>
+    </w:p>
+    <w:p>
+      <w:r>
+        <w:t>Native resolution  Station observations  |  Daily summaries</w:t>
+      </w:r>
+    </w:p>
+    <w:p>
+      <w:r>
+        <w:t>Region and tools  Exact catalogue station  |  stations</w:t>
+      </w:r>
+    </w:p>
+    <w:p>
+      <w:r>
+        <w:t>Variables  T2M, T2M_MAX, T2M_MIN, T2MDEW, PRECTOTCORR, PS, SLP, WS10M</w:t>
+      </w:r>
+    </w:p>
+    <w:p>
+      <w:r>
+        <w:t>USAF, WBAN and location are required together. This is not hourly ISD or GHCN. Hybrid finishes NOAA, then ERA5, then NASA, then optional monthly Gap Fill.</w:t>
+      </w:r>
+    </w:p>
+    <w:p>
+      <w:pPr>
+        <w:jc w:val="start"/>
+        <w:bidi/>
+      </w:pPr>
+      <w:r>
+        <w:rPr>
+          <w:rtl/>
+        </w:rPr>
+        <w:t>USAF وWBAN والموقع معًا؛ ليس ISD الساعي ولا GHCN. الهجين ينهي NOAA ثم ERA5 ثم NASA ثم Gap Fill الشهري.</w:t>
+      </w:r>
+    </w:p>
+    <w:p>
+      <w:pPr>
+        <w:spacing w:after="320"/>
+      </w:pPr>
+      <w:r>
+        <w:t>Official reference  https://www.ncei.noaa.gov/data/global-summary-of-the-day/</w:t>
+      </w:r>
+    </w:p>
+    <w:p>
+      <w:pPr>
+        <w:pStyle w:val="Heading1"/>
+      </w:pPr>
+      <w:r>
+        <w:t>Copernicus CDS ERA5-Land (Need Sign In)</w:t>
+      </w:r>
+    </w:p>
+    <w:p>
+      <w:r>
+        <w:t>Coverage  1950-01 to Latest published CDS ARCO data</w:t>
+      </w:r>
+    </w:p>
+    <w:p>
+      <w:r>
+        <w:t>Native resolution  0.1 degree API grid  |  Daily</w:t>
+      </w:r>
+    </w:p>
+    <w:p>
+      <w:r>
+        <w:t>Region and tools  Global land  |  points, stations</w:t>
+      </w:r>
+    </w:p>
+    <w:p>
+      <w:r>
+        <w:t>Variables  T2M, T2M_MAX, T2M_MIN, T2MDEW, RH2M, TS, PS, WS10M, WD10M, PRECTOTCORR, ALLSKY_SFC_SW_DWN</w:t>
+      </w:r>
+    </w:p>
+    <w:p>
+      <w:r>
+        <w:t>Need Sign In: personal CDS token and accepted dataset terms. ARCO is already hourly de-accumulated; a day requires 24 UTC hours. Max/min use hourly samples; RH is derived from temperature/dewpoint. The service returns the full archive per variable, filtered locally with a 64 MB limit. Protocol/conversion tests pass; authenticated end-to-end access remains unverified.</w:t>
+      </w:r>
+    </w:p>
+    <w:p>
+      <w:pPr>
+        <w:jc w:val="start"/>
+        <w:bidi/>
+      </w:pPr>
+      <w:r>
+        <w:rPr>
+          <w:rtl/>
+        </w:rPr>
+        <w:t>Need Sign In: رمز CDS الشخصي وقبول شروط المنتج. ARCO ساعي منزوع التراكم بالفعل؛ اليوم يتطلب 24 ساعة UTC. العظمى والصغرى من العينات الساعية، والرطوبة مشتقة من الحرارة والندى. الخدمة ترجع كامل الأرشيف لكل متغير ثم تُرشح الفترة محليًا بحد 64MB. المسار منفذ واختُبر بروتوكوله وتحويلاته؛ لم يُختبر بحساب حقيقي.</w:t>
+      </w:r>
+    </w:p>
+    <w:p>
+      <w:pPr>
+        <w:spacing w:after="320"/>
+      </w:pPr>
+      <w:r>
+        <w:t>Official reference  https://cds.climate.copernicus.eu/datasets/reanalysis-era5-land-timeseries</w:t>
+      </w:r>
+    </w:p>
+    <w:p>
+      <w:r>
+        <w:br w:type="page"/>
+      </w:r>
+    </w:p>
+    <w:p>
+      <w:pPr>
+        <w:pStyle w:val="Heading1"/>
+      </w:pPr>
+      <w:r>
+        <w:t>NASA IMERG V07 Daily Final (Need Sign In)</w:t>
+      </w:r>
+    </w:p>
+    <w:p>
+      <w:r>
+        <w:t>Coverage  File-specific GES DISC catalogue to Latest Final run (delayed)</w:t>
+      </w:r>
+    </w:p>
+    <w:p>
+      <w:r>
+        <w:t>Native resolution  0.1 degree  |  Daily</w:t>
+      </w:r>
+    </w:p>
+    <w:p>
+      <w:r>
+        <w:t>Region and tools  Global grid; missing cells retained  |  points, stations</w:t>
+      </w:r>
+    </w:p>
+    <w:p>
+      <w:r>
+        <w:t>Variables  PRECTOTCORR</w:t>
+      </w:r>
+    </w:p>
+    <w:p>
+      <w:r>
+        <w:t>Need Sign In: NASA Earthdata account with GES DISC authorization. Final daily precipitation is mm/day, with no second multiplication by 24. Adapter implemented; live authenticated download remains unverified.</w:t>
+      </w:r>
+    </w:p>
+    <w:p>
+      <w:pPr>
+        <w:jc w:val="start"/>
+        <w:bidi/>
+      </w:pPr>
+      <w:r>
+        <w:rPr>
+          <w:rtl/>
+        </w:rPr>
+        <w:t>Need Sign In: حساب NASA Earthdata وإجازة GES DISC. أمطار Final اليومية بوحدة mm/day؛ لا ضرب ثانٍ في 24. المسار منفذ؛ التنزيل بحساب حقيقي لم يُختبر بعد.</w:t>
+      </w:r>
+    </w:p>
+    <w:p>
+      <w:pPr>
+        <w:spacing w:after="320"/>
+      </w:pPr>
+      <w:r>
+        <w:t>Official reference  https://disc.gsfc.nasa.gov/datasets/GPM_3IMERGDF_07/summary</w:t>
+      </w:r>
+    </w:p>
+    <w:p>
+      <w:pPr>
+        <w:pStyle w:val="Heading1"/>
+      </w:pPr>
+      <w:r>
+        <w:t>CHIRPS v3 (Monthly Rainfall)</w:t>
+      </w:r>
+    </w:p>
+    <w:p>
+      <w:r>
+        <w:t>Coverage  1981-01 to Latest final month</w:t>
+      </w:r>
+    </w:p>
+    <w:p>
+      <w:r>
+        <w:t>Native resolution  0.05 degree  |  Monthly</w:t>
+      </w:r>
+    </w:p>
+    <w:p>
+      <w:r>
+        <w:t>Region and tools  Land 60S to 60N  |  points, stations, regional</w:t>
+      </w:r>
+    </w:p>
+    <w:p>
+      <w:r>
+        <w:t>Variables  PRECTOTCORR</w:t>
+      </w:r>
+    </w:p>
+    <w:p>
+      <w:r>
+        <w:t>Final monthly rainfall only; daily CHIRPS ingestion is not implemented. Zero is valid; missing stays NULL.</w:t>
+      </w:r>
+    </w:p>
+    <w:p>
+      <w:pPr>
+        <w:jc w:val="start"/>
+        <w:bidi/>
+      </w:pPr>
+      <w:r>
+        <w:rPr>
+          <w:rtl/>
+        </w:rPr>
+        <w:t>أمطار شهرية نهائية؛ لم يُنفذ تنزيل CHIRPS اليومي. الصفر صحيح والمفقود NULL.</w:t>
+      </w:r>
+    </w:p>
+    <w:p>
+      <w:pPr>
+        <w:spacing w:after="320"/>
+      </w:pPr>
+      <w:r>
+        <w:t>Official reference  https://www.chc.ucsb.edu/data/chirps3</w:t>
+      </w:r>
+    </w:p>
+    <w:p>
+      <w:r>
+        <w:br w:type="page"/>
+      </w:r>
+    </w:p>
+    <w:p>
+      <w:pPr>
+        <w:pStyle w:val="Heading1"/>
+      </w:pPr>
+      <w:r>
+        <w:t>TerraClimate v1.1 (Monthly Climate)</w:t>
+      </w:r>
+    </w:p>
+    <w:p>
+      <w:r>
+        <w:t>Coverage  1950-01 to Latest published month; inspected from time axis</w:t>
+      </w:r>
+    </w:p>
+    <w:p>
+      <w:r>
+        <w:t>Native resolution  1/24 degree (~4 km)  |  Monthly</w:t>
+      </w:r>
+    </w:p>
+    <w:p>
+      <w:r>
+        <w:t>Region and tools  Global land  |  points, stations</w:t>
+      </w:r>
+    </w:p>
+    <w:p>
+      <w:r>
+        <w:t>Variables  T2M, T2M_MAX, T2M_MIN, PRECTOTCORR, WS10M, ALLSKY_SFC_SW_DWN</w:t>
+      </w:r>
+    </w:p>
+    <w:p>
+      <w:r>
+        <w:t>v1.1 is separate from v1.0. CF scale/offset are read per variable. Mean temperature is (tmax+tmin)/2. Rainfall is a monthly total.</w:t>
+      </w:r>
+    </w:p>
+    <w:p>
+      <w:pPr>
+        <w:jc w:val="start"/>
+        <w:bidi/>
+      </w:pPr>
+      <w:r>
+        <w:rPr>
+          <w:rtl/>
+        </w:rPr>
+        <w:t>الإصدار 1.1 مستقل عن 1.0. قراءة CF scale/offset من كل متغير. متوسط الحرارة مشتق من (العظمى+الصغرى)/2. المطر مجموع شهري.</w:t>
+      </w:r>
+    </w:p>
+    <w:p>
+      <w:pPr>
+        <w:spacing w:after="320"/>
+      </w:pPr>
+      <w:r>
+        <w:t>Official reference  https://www.climatologylab.org/terraclimate.html</w:t>
+      </w:r>
+    </w:p>
+    <w:p>
+      <w:pPr>
+        <w:pStyle w:val="Heading1"/>
+      </w:pPr>
+      <w:r>
+        <w:t>CHELSA v2.1 (Monthly Climate)</w:t>
+      </w:r>
+    </w:p>
+    <w:p>
+      <w:r>
+        <w:t>Coverage  1979/1980; variable-specific catalogue to 2018/2021; variable-specific catalogue</w:t>
+      </w:r>
+    </w:p>
+    <w:p>
+      <w:r>
+        <w:t>Native resolution  30 arcsec (~1 km)  |  Monthly</w:t>
+      </w:r>
+    </w:p>
+    <w:p>
+      <w:r>
+        <w:t>Region and tools  Global land  |  points, stations, regional</w:t>
+      </w:r>
+    </w:p>
+    <w:p>
+      <w:r>
+        <w:t>Variables  T2M, T2M_MAX, T2M_MIN, PRECTOTCORR, WS10M, RH2M, CLOUD_AMT</w:t>
+      </w:r>
+    </w:p>
+    <w:p>
+      <w:r>
+        <w:t>Units/scaling are validated from each file; dates vary by variable. Solar radiation is excluded pending conflicting unit metadata. Unavailable files stay NULL.</w:t>
+      </w:r>
+    </w:p>
+    <w:p>
+      <w:pPr>
+        <w:jc w:val="start"/>
+        <w:bidi/>
+      </w:pPr>
+      <w:r>
+        <w:rPr>
+          <w:rtl/>
+        </w:rPr>
+        <w:t>تُقرأ الوحدات والتحويل من الملف نفسه؛ مدى التواريخ يختلف حسب المتغير. الإشعاع الشمسي مستبعد حتى حل تعارض بيانات وحدته. الملف غير المتاح يبقى NULL.</w:t>
+      </w:r>
+    </w:p>
+    <w:p>
+      <w:pPr>
+        <w:spacing w:after="320"/>
+      </w:pPr>
+      <w:r>
+        <w:t>Official reference  https://www.chelsa-climate.org/datasets/chelsa_monthly</w:t>
+      </w:r>
+    </w:p>
+    <w:p>
+      <w:r>
+        <w:br w:type="page"/>
+      </w:r>
+    </w:p>
+    <w:p>
+      <w:pPr>
+        <w:pStyle w:val="Heading1"/>
+      </w:pPr>
+      <w:r>
+        <w:t>MODIS MOD11A2 (Daytime Surface Temperature)</w:t>
+      </w:r>
+    </w:p>
+    <w:p>
+      <w:r>
+        <w:t>Coverage  2000-02 to Available site dates from API</w:t>
+      </w:r>
+    </w:p>
+    <w:p>
+      <w:r>
+        <w:t>Native resolution  Nominal 1 km  |  8-day clear-sky composites; explicit monthly aggregation</w:t>
+      </w:r>
+    </w:p>
+    <w:p>
+      <w:r>
+        <w:t>Region and tools  Global land  |  points, stations</w:t>
+      </w:r>
+    </w:p>
+    <w:p>
+      <w:r>
+        <w:t>Variables  TS</w:t>
+      </w:r>
+    </w:p>
+    <w:p>
+      <w:r>
+        <w:t>Daytime surface temperature, not air temperature. Monthly estimates weight quality-accepted clear-sky days. No synthetic daily observations or surface-air differences without air data.</w:t>
+      </w:r>
+    </w:p>
+    <w:p>
+      <w:pPr>
+        <w:jc w:val="start"/>
+        <w:bidi/>
+      </w:pPr>
+      <w:r>
+        <w:rPr>
+          <w:rtl/>
+        </w:rPr>
+        <w:t>حرارة سطح نهارية، وليست حرارة هواء. تجميع شهري موزون بأيام السماء الصافية المقبولة بالجودة. لا أيام رصد مصطنعة ولا فرق سطح/هواء دون حرارة هواء.</w:t>
+      </w:r>
+    </w:p>
+    <w:p>
+      <w:pPr>
+        <w:spacing w:after="320"/>
+      </w:pPr>
+      <w:r>
+        <w:t>Official reference  https://modis.ornl.gov/data/modis_webservice.html</w:t>
+      </w:r>
+    </w:p>
+    <w:p>
+      <w:pPr>
+        <w:pStyle w:val="Heading1"/>
+      </w:pPr>
+      <w:r>
+        <w:t>MODIS MOD11A2 (Nighttime Surface Temperature)</w:t>
+      </w:r>
+    </w:p>
+    <w:p>
+      <w:r>
+        <w:t>Coverage  2000-02 to Available site dates from API</w:t>
+      </w:r>
+    </w:p>
+    <w:p>
+      <w:r>
+        <w:t>Native resolution  Nominal 1 km  |  8-day clear-sky composites; explicit monthly aggregation</w:t>
+      </w:r>
+    </w:p>
+    <w:p>
+      <w:r>
+        <w:t>Region and tools  Global land  |  points, stations</w:t>
+      </w:r>
+    </w:p>
+    <w:p>
+      <w:r>
+        <w:t>Variables  TS</w:t>
+      </w:r>
+    </w:p>
+    <w:p>
+      <w:r>
+        <w:t>Nighttime surface temperature stays separate from daytime, with the same quality/cloud screening. Coverage reflects accepted clear-sky days.</w:t>
+      </w:r>
+    </w:p>
+    <w:p>
+      <w:pPr>
+        <w:jc w:val="start"/>
+        <w:bidi/>
+      </w:pPr>
+      <w:r>
+        <w:rPr>
+          <w:rtl/>
+        </w:rPr>
+        <w:t>حرارة سطح ليلية منفصلة عن النهارية، بنفس فحص الجودة والسحب. نسبة التغطية تعكس الأيام الصافية المقبولة.</w:t>
+      </w:r>
+    </w:p>
+    <w:p>
+      <w:pPr>
+        <w:spacing w:after="320"/>
+      </w:pPr>
+      <w:r>
+        <w:t>Official reference  https://modis.ornl.gov/data/modis_webservice.html</w:t>
+      </w:r>
+    </w:p>
+    <w:p>
+      <w:r>
+        <w:br w:type="page"/>
+      </w:r>
+    </w:p>
+    <w:p>
+      <w:pPr>
+        <w:pStyle w:val="Heading1"/>
+      </w:pPr>
+      <w:r>
+        <w:t>NOAA GHCN-Daily (Station Observations Only)</w:t>
+      </w:r>
+    </w:p>
+    <w:p>
+      <w:r>
+        <w:t>Coverage  Station/element-specific to Station/element-specific</w:t>
+      </w:r>
+    </w:p>
+    <w:p>
+      <w:r>
+        <w:t>Native resolution  Station location  |  Daily</w:t>
+      </w:r>
+    </w:p>
+    <w:p>
+      <w:r>
+        <w:t>Region and tools  Catalogue stations only  |  stations</w:t>
+      </w:r>
+    </w:p>
+    <w:p>
+      <w:r>
+        <w:t>Variables  T2M, T2M_MAX, T2M_MIN, PRECTOTCORR</w:t>
+      </w:r>
+    </w:p>
+    <w:p>
+      <w:r>
+        <w:t>Requires an explicit 11-character GHCN_ID and matching coordinates. No USAF/WBAN conversion or nearest-station substitution. Nonblank QFLAG values are excluded; absent TAVG is not invented.</w:t>
+      </w:r>
+    </w:p>
+    <w:p>
+      <w:pPr>
+        <w:jc w:val="start"/>
+        <w:bidi/>
+      </w:pPr>
+      <w:r>
+        <w:rPr>
+          <w:rtl/>
+        </w:rPr>
+        <w:t>يلزم حقل GHCN_ID صريح من 11 حرفًا وإحداثيات مطابقة. لا تحويل تلقائي من USAF/WBAN ولا أقرب محطة. قيم QFLAG غير الفارغة تستبعد؛ TAVG غير الموجود لا يُخترع.</w:t>
+      </w:r>
+    </w:p>
+    <w:p>
+      <w:pPr>
+        <w:spacing w:after="320"/>
+      </w:pPr>
+      <w:r>
+        <w:t>Official reference  https://www.ncei.noaa.gov/products/land-based-station/global-historical-climatology-network-daily</w:t>
       </w:r>
     </w:p>
     <w:sectPr>
+      <w:footerReference w:type="default" r:id="rId9"/>
       <w:pgSz w:w="12240" w:h="15840"/>
-      <w:pgMar w:top="1080" w:right="1080" w:bottom="1080" w:left="1080" w:header="720" w:footer="720" w:gutter="0"/>
+      <w:pgMar w:top="1008" w:right="1152" w:bottom="1008" w:left="1152" w:header="720" w:footer="720" w:gutter="0"/>
       <w:cols w:space="720"/>
       <w:docGrid w:linePitch="360"/>
     </w:sectPr>
   </w:body>
 </w:document>
+</file>
+
+<file path=word/footer1.xml><?xml version="1.0" encoding="utf-8"?>
+<w:ftr xmlns:m="http://schemas.openxmlformats.org/officeDocument/2006/math" xmlns:mc="http://schemas.openxmlformats.org/markup-compatibility/2006" xmlns:mo="http://schemas.microsoft.com/office/mac/office/2008/main" xmlns:mv="urn:schemas-microsoft-com:mac:vml" xmlns:o="urn:schemas-microsoft-com:office:office" xmlns:r="http://schemas.openxmlformats.org/officeDocument/2006/relationships" xmlns:v="urn:schemas-microsoft-com:vml" xmlns:w10="urn:schemas-microsoft-com:office:word" xmlns:w14="http://schemas.microsoft.com/office/word/2010/wordml" xmlns:w="http://schemas.openxmlformats.org/wordprocessingml/2006/main" xmlns:wne="http://schemas.microsoft.com/office/word/2006/wordml" xmlns:wp14="http://schemas.microsoft.com/office/word/2010/wordprocessingDrawing" xmlns:wp="http://schemas.openxmlformats.org/drawingml/2006/wordprocessingDrawing" xmlns:wpc="http://schemas.microsoft.com/office/word/2010/wordprocessingCanvas" xmlns:wpg="http://schemas.microsoft.com/office/word/2010/wordprocessingGroup" xmlns:wpi="http://schemas.microsoft.com/office/word/2010/wordprocessingInk" xmlns:wps="http://schemas.microsoft.com/office/word/2010/wordprocessingShape" mc:Ignorable="w14 wp14">
+  <w:p>
+    <w:pPr/>
+    <w:r>
+      <w:rPr>
+        <w:sz w:val="16"/>
+      </w:rPr>
+      <w:t>MIRSAD  |  Ahmad Ibrahim  |  Source catalogue 2026-10-18-products-v1</w:t>
+    </w:r>
+  </w:p>
+</w:ftr>
 </file>
 
 <file path=word/numbering.xml><?xml version="1.0" encoding="utf-8"?>
@@ -4188,6 +1109,14 @@
     <w:name w:val="Normal"/>
     <w:qFormat/>
     <w:rsid w:val="00FC693F"/>
+    <w:pPr>
+      <w:spacing w:after="120" w:line="264" w:lineRule="auto"/>
+    </w:pPr>
+    <w:rPr>
+      <w:rFonts w:ascii="Arial" w:hAnsi="Arial" w:cs="Arial"/>
+      <w:color w:val="151515"/>
+      <w:sz w:val="21"/>
+    </w:rPr>
   </w:style>
   <w:style w:type="paragraph" w:styleId="Header">
     <w:name w:val="header"/>
@@ -4244,15 +1173,15 @@
     <w:pPr>
       <w:keepNext/>
       <w:keepLines/>
-      <w:spacing w:before="480" w:after="0"/>
+      <w:spacing w:before="480" w:after="120"/>
       <w:outlineLvl w:val="0"/>
     </w:pPr>
     <w:rPr>
-      <w:rFonts w:asciiTheme="majorHAnsi" w:eastAsiaTheme="majorEastAsia" w:hAnsiTheme="majorHAnsi" w:cstheme="majorBidi"/>
+      <w:rFonts w:asciiTheme="majorHAnsi" w:eastAsiaTheme="majorEastAsia" w:hAnsiTheme="majorHAnsi" w:cstheme="majorBidi" w:ascii="Arial" w:hAnsi="Arial" w:cs="Arial"/>
       <w:b/>
       <w:bCs/>
-      <w:color w:val="365F91" w:themeColor="accent1" w:themeShade="BF"/>
-      <w:sz w:val="28"/>
+      <w:color w:val="151515"/>
+      <w:sz w:val="32"/>
       <w:szCs w:val="28"/>
     </w:rPr>
   </w:style>
@@ -4268,14 +1197,14 @@
     <w:pPr>
       <w:keepNext/>
       <w:keepLines/>
-      <w:spacing w:before="200" w:after="0"/>
+      <w:spacing w:before="200" w:after="120"/>
       <w:outlineLvl w:val="1"/>
     </w:pPr>
     <w:rPr>
-      <w:rFonts w:asciiTheme="majorHAnsi" w:eastAsiaTheme="majorEastAsia" w:hAnsiTheme="majorHAnsi" w:cstheme="majorBidi"/>
+      <w:rFonts w:asciiTheme="majorHAnsi" w:eastAsiaTheme="majorEastAsia" w:hAnsiTheme="majorHAnsi" w:cstheme="majorBidi" w:ascii="Arial" w:hAnsi="Arial" w:cs="Arial"/>
       <w:b/>
       <w:bCs/>
-      <w:color w:val="4F81BD" w:themeColor="accent1"/>
+      <w:color w:val="151515"/>
       <w:sz w:val="26"/>
       <w:szCs w:val="26"/>
     </w:rPr>
@@ -4530,18 +1459,15 @@
     <w:qFormat/>
     <w:rsid w:val="00FC693F"/>
     <w:pPr>
-      <w:pBdr>
-        <w:bottom w:val="single" w:sz="8" w:space="4" w:color="4F81BD" w:themeColor="accent1"/>
-      </w:pBdr>
-      <w:spacing w:after="300" w:line="240" w:lineRule="auto"/>
+      <w:spacing w:after="120" w:line="240" w:lineRule="auto"/>
       <w:contextualSpacing/>
     </w:pPr>
     <w:rPr>
-      <w:rFonts w:asciiTheme="majorHAnsi" w:eastAsiaTheme="majorEastAsia" w:hAnsiTheme="majorHAnsi" w:cstheme="majorBidi"/>
-      <w:color w:val="17365D" w:themeColor="text2" w:themeShade="BF"/>
+      <w:rFonts w:asciiTheme="majorHAnsi" w:eastAsiaTheme="majorEastAsia" w:hAnsiTheme="majorHAnsi" w:cstheme="majorBidi" w:ascii="Arial" w:hAnsi="Arial" w:cs="Arial"/>
+      <w:color w:val="151515"/>
       <w:spacing w:val="5"/>
       <w:kern w:val="28"/>
-      <w:sz w:val="52"/>
+      <w:sz w:val="46"/>
       <w:szCs w:val="52"/>
     </w:rPr>
   </w:style>
@@ -5017,9 +1943,6 @@
     <w:qFormat/>
     <w:rsid w:val="00FC693F"/>
     <w:pPr>
-      <w:pBdr>
-        <w:bottom w:val="single" w:sz="4" w:space="4" w:color="4F81BD" w:themeColor="accent1"/>
-      </w:pBdr>
       <w:spacing w:before="200" w:after="280"/>
       <w:ind w:left="936" w:right="936"/>
     </w:pPr>

</xml_diff>